<commit_message>
discusion de ideas de proyecto final y opiniones de proyectos de nuestros compañeros
</commit_message>
<xml_diff>
--- a/Lo que vimos en la semana              lunes.docx
+++ b/Lo que vimos en la semana              lunes.docx
@@ -65,7 +65,39 @@
           <w:sz w:val="40"/>
           <w:szCs w:val="40"/>
         </w:rPr>
-        <w:t xml:space="preserve">Ese día el doc. Héctor nos explico como resolver una sumatoria matemática donde sustituimos la variable X y también tomar en cuenta que la variable de control </w:t>
+        <w:t xml:space="preserve">Ese día el doc. Héctor nos </w:t>
+      </w:r>
+      <w:proofErr w:type="spellStart"/>
+      <w:r>
+        <w:rPr>
+          <w:sz w:val="40"/>
+          <w:szCs w:val="40"/>
+        </w:rPr>
+        <w:t>explico</w:t>
+      </w:r>
+      <w:proofErr w:type="spellEnd"/>
+      <w:r>
+        <w:rPr>
+          <w:sz w:val="40"/>
+          <w:szCs w:val="40"/>
+        </w:rPr>
+        <w:t xml:space="preserve"> </w:t>
+      </w:r>
+      <w:proofErr w:type="spellStart"/>
+      <w:r>
+        <w:rPr>
+          <w:sz w:val="40"/>
+          <w:szCs w:val="40"/>
+        </w:rPr>
+        <w:t>como</w:t>
+      </w:r>
+      <w:proofErr w:type="spellEnd"/>
+      <w:r>
+        <w:rPr>
+          <w:sz w:val="40"/>
+          <w:szCs w:val="40"/>
+        </w:rPr>
+        <w:t xml:space="preserve"> resolver una sumatoria matemática donde sustituimos la variable X y también tomar en cuenta que la variable de control </w:t>
       </w:r>
       <w:proofErr w:type="gramStart"/>
       <w:r>
@@ -275,16 +307,110 @@
         <w:rPr>
           <w:sz w:val="40"/>
           <w:szCs w:val="40"/>
+        </w:rPr>
+      </w:pPr>
+      <w:r>
+        <w:rPr>
+          <w:sz w:val="40"/>
+          <w:szCs w:val="40"/>
+        </w:rPr>
+        <w:t xml:space="preserve">        (</w:t>
+      </w:r>
+      <w:proofErr w:type="spellStart"/>
+      <w:r>
+        <w:rPr>
+          <w:sz w:val="40"/>
+          <w:szCs w:val="40"/>
+        </w:rPr>
+        <w:t>X+</w:t>
+      </w:r>
+      <w:proofErr w:type="gramStart"/>
+      <w:r>
+        <w:rPr>
+          <w:sz w:val="40"/>
+          <w:szCs w:val="40"/>
+        </w:rPr>
+        <w:t>i</w:t>
+      </w:r>
+      <w:proofErr w:type="spellEnd"/>
+      <w:r>
+        <w:rPr>
+          <w:sz w:val="40"/>
+          <w:szCs w:val="40"/>
+        </w:rPr>
+        <w:t>)*</w:t>
+      </w:r>
+      <w:proofErr w:type="gramEnd"/>
+      <w:r>
+        <w:rPr>
+          <w:sz w:val="40"/>
+          <w:szCs w:val="40"/>
+        </w:rPr>
+        <w:t>i             R=10</w:t>
+      </w:r>
+    </w:p>
+    <w:p>
+      <w:pPr>
+        <w:rPr>
+          <w:sz w:val="40"/>
+          <w:szCs w:val="40"/>
+        </w:rPr>
+      </w:pPr>
+      <w:r>
+        <w:rPr>
+          <w:sz w:val="40"/>
+          <w:szCs w:val="40"/>
+        </w:rPr>
+        <w:t>i=1</w:t>
+      </w:r>
+    </w:p>
+    <w:p>
+      <w:pPr>
+        <w:rPr>
+          <w:sz w:val="40"/>
+          <w:szCs w:val="40"/>
+        </w:rPr>
+      </w:pPr>
+      <w:r>
+        <w:rPr>
+          <w:sz w:val="40"/>
+          <w:szCs w:val="40"/>
+        </w:rPr>
+        <w:t>dado el valor constante x=</w:t>
+      </w:r>
+      <w:r>
+        <w:rPr>
+          <w:sz w:val="40"/>
+          <w:szCs w:val="40"/>
+        </w:rPr>
+        <w:t xml:space="preserve"> -2 se calcula el resultado iterando el contador i de 1 a 4</w:t>
+      </w:r>
+    </w:p>
+    <w:p>
+      <w:pPr>
+        <w:rPr>
+          <w:sz w:val="40"/>
+          <w:szCs w:val="40"/>
           <w:lang w:val="en-US"/>
         </w:rPr>
       </w:pPr>
+      <w:proofErr w:type="spellStart"/>
       <w:r>
         <w:rPr>
           <w:sz w:val="40"/>
           <w:szCs w:val="40"/>
           <w:lang w:val="en-US"/>
         </w:rPr>
-        <w:t xml:space="preserve">        (</w:t>
+        <w:t>procedimiento</w:t>
+      </w:r>
+      <w:proofErr w:type="spellEnd"/>
+      <w:r>
+        <w:rPr>
+          <w:sz w:val="40"/>
+          <w:szCs w:val="40"/>
+          <w:lang w:val="en-US"/>
+        </w:rPr>
+        <w:t xml:space="preserve"> </w:t>
       </w:r>
       <w:proofErr w:type="spellStart"/>
       <w:r>
@@ -293,7 +419,33 @@
           <w:szCs w:val="40"/>
           <w:lang w:val="en-US"/>
         </w:rPr>
-        <w:t>X+</w:t>
+        <w:t>aquí</w:t>
+      </w:r>
+      <w:proofErr w:type="spellEnd"/>
+      <w:r>
+        <w:rPr>
+          <w:sz w:val="40"/>
+          <w:szCs w:val="40"/>
+          <w:lang w:val="en-US"/>
+        </w:rPr>
+        <w:t>:</w:t>
+      </w:r>
+    </w:p>
+    <w:p>
+      <w:pPr>
+        <w:rPr>
+          <w:sz w:val="40"/>
+          <w:szCs w:val="40"/>
+          <w:lang w:val="en-US"/>
+        </w:rPr>
+      </w:pPr>
+      <w:r>
+        <w:rPr>
+          <w:sz w:val="40"/>
+          <w:szCs w:val="40"/>
+          <w:lang w:val="en-US"/>
+        </w:rPr>
+        <w:t>it = (-2+</w:t>
       </w:r>
       <w:proofErr w:type="gramStart"/>
       <w:r>
@@ -302,18 +454,26 @@
           <w:szCs w:val="40"/>
           <w:lang w:val="en-US"/>
         </w:rPr>
-        <w:t>i</w:t>
-      </w:r>
-      <w:proofErr w:type="spellEnd"/>
+        <w:t>1)*</w:t>
+      </w:r>
+      <w:proofErr w:type="gramEnd"/>
       <w:r>
         <w:rPr>
           <w:sz w:val="40"/>
           <w:szCs w:val="40"/>
           <w:lang w:val="en-US"/>
         </w:rPr>
-        <w:t>)*</w:t>
-      </w:r>
-      <w:proofErr w:type="spellStart"/>
+        <w:t>1</w:t>
+      </w:r>
+      <w:proofErr w:type="gramStart"/>
+      <w:r>
+        <w:rPr>
+          <w:sz w:val="40"/>
+          <w:szCs w:val="40"/>
+          <w:lang w:val="en-US"/>
+        </w:rPr>
+        <w:t>=(</w:t>
+      </w:r>
       <w:proofErr w:type="gramEnd"/>
       <w:r>
         <w:rPr>
@@ -321,24 +481,25 @@
           <w:szCs w:val="40"/>
           <w:lang w:val="en-US"/>
         </w:rPr>
-        <w:t>i</w:t>
-      </w:r>
-      <w:proofErr w:type="spellEnd"/>
+        <w:t>-</w:t>
+      </w:r>
+      <w:proofErr w:type="gramStart"/>
       <w:r>
         <w:rPr>
           <w:sz w:val="40"/>
           <w:szCs w:val="40"/>
           <w:lang w:val="en-US"/>
         </w:rPr>
-        <w:t xml:space="preserve">             R=1</w:t>
-      </w:r>
+        <w:t>1)*</w:t>
+      </w:r>
+      <w:proofErr w:type="gramEnd"/>
       <w:r>
         <w:rPr>
           <w:sz w:val="40"/>
           <w:szCs w:val="40"/>
           <w:lang w:val="en-US"/>
         </w:rPr>
-        <w:t>0</w:t>
+        <w:t>1=1</w:t>
       </w:r>
     </w:p>
     <w:p>
@@ -349,242 +510,100 @@
           <w:lang w:val="en-US"/>
         </w:rPr>
       </w:pPr>
-      <w:proofErr w:type="spellStart"/>
       <w:r>
         <w:rPr>
           <w:sz w:val="40"/>
           <w:szCs w:val="40"/>
           <w:lang w:val="en-US"/>
         </w:rPr>
-        <w:t>i</w:t>
-      </w:r>
-      <w:proofErr w:type="spellEnd"/>
+        <w:t>it = (-2+</w:t>
+      </w:r>
+      <w:proofErr w:type="gramStart"/>
       <w:r>
         <w:rPr>
           <w:sz w:val="40"/>
           <w:szCs w:val="40"/>
           <w:lang w:val="en-US"/>
         </w:rPr>
-        <w:t>=1</w:t>
-      </w:r>
-    </w:p>
-    <w:p>
-      <w:pPr>
-        <w:rPr>
-          <w:sz w:val="40"/>
-          <w:szCs w:val="40"/>
-        </w:rPr>
-      </w:pPr>
-      <w:r>
-        <w:rPr>
-          <w:sz w:val="40"/>
-          <w:szCs w:val="40"/>
-        </w:rPr>
-        <w:t>dado el valor constante x=</w:t>
-      </w:r>
-      <w:r>
-        <w:rPr>
-          <w:sz w:val="40"/>
-          <w:szCs w:val="40"/>
-        </w:rPr>
-        <w:t xml:space="preserve"> -2 se calcula el resultado iterando el contador i de 1 a 4</w:t>
-      </w:r>
-    </w:p>
-    <w:p>
-      <w:pPr>
-        <w:rPr>
-          <w:sz w:val="40"/>
-          <w:szCs w:val="40"/>
-        </w:rPr>
-      </w:pPr>
-      <w:r>
-        <w:rPr>
-          <w:sz w:val="40"/>
-          <w:szCs w:val="40"/>
-        </w:rPr>
-        <w:t>procedimiento aquí:</w:t>
-      </w:r>
-    </w:p>
-    <w:p>
-      <w:pPr>
-        <w:rPr>
-          <w:sz w:val="40"/>
-          <w:szCs w:val="40"/>
-        </w:rPr>
-      </w:pPr>
-      <w:proofErr w:type="spellStart"/>
-      <w:r>
-        <w:rPr>
-          <w:sz w:val="40"/>
-          <w:szCs w:val="40"/>
-        </w:rPr>
-        <w:t>it</w:t>
-      </w:r>
-      <w:proofErr w:type="spellEnd"/>
-      <w:r>
-        <w:rPr>
-          <w:sz w:val="40"/>
-          <w:szCs w:val="40"/>
-        </w:rPr>
-        <w:t xml:space="preserve"> = (-2+</w:t>
+        <w:t>2)*</w:t>
+      </w:r>
+      <w:proofErr w:type="gramEnd"/>
+      <w:r>
+        <w:rPr>
+          <w:sz w:val="40"/>
+          <w:szCs w:val="40"/>
+          <w:lang w:val="en-US"/>
+        </w:rPr>
+        <w:t>2</w:t>
       </w:r>
       <w:proofErr w:type="gramStart"/>
       <w:r>
         <w:rPr>
           <w:sz w:val="40"/>
           <w:szCs w:val="40"/>
-        </w:rPr>
-        <w:t>1)*</w:t>
+          <w:lang w:val="en-US"/>
+        </w:rPr>
+        <w:t>=(0)*</w:t>
       </w:r>
       <w:proofErr w:type="gramEnd"/>
       <w:r>
         <w:rPr>
           <w:sz w:val="40"/>
           <w:szCs w:val="40"/>
-        </w:rPr>
-        <w:t>1</w:t>
+          <w:lang w:val="en-US"/>
+        </w:rPr>
+        <w:t>2=0</w:t>
+      </w:r>
+    </w:p>
+    <w:p>
+      <w:pPr>
+        <w:rPr>
+          <w:sz w:val="40"/>
+          <w:szCs w:val="40"/>
+          <w:lang w:val="en-US"/>
+        </w:rPr>
+      </w:pPr>
+      <w:r>
+        <w:rPr>
+          <w:sz w:val="40"/>
+          <w:szCs w:val="40"/>
+          <w:lang w:val="en-US"/>
+        </w:rPr>
+        <w:t>it = (-2+</w:t>
       </w:r>
       <w:proofErr w:type="gramStart"/>
       <w:r>
         <w:rPr>
           <w:sz w:val="40"/>
           <w:szCs w:val="40"/>
-        </w:rPr>
-        <w:t>=(</w:t>
+          <w:lang w:val="en-US"/>
+        </w:rPr>
+        <w:t>3)*</w:t>
       </w:r>
       <w:proofErr w:type="gramEnd"/>
       <w:r>
         <w:rPr>
           <w:sz w:val="40"/>
           <w:szCs w:val="40"/>
-        </w:rPr>
-        <w:t>-</w:t>
+          <w:lang w:val="en-US"/>
+        </w:rPr>
+        <w:t>3</w:t>
       </w:r>
       <w:proofErr w:type="gramStart"/>
       <w:r>
         <w:rPr>
           <w:sz w:val="40"/>
           <w:szCs w:val="40"/>
-        </w:rPr>
-        <w:t>1)*</w:t>
+          <w:lang w:val="en-US"/>
+        </w:rPr>
+        <w:t>=(1)*</w:t>
       </w:r>
       <w:proofErr w:type="gramEnd"/>
       <w:r>
         <w:rPr>
           <w:sz w:val="40"/>
           <w:szCs w:val="40"/>
-        </w:rPr>
-        <w:t>1=1</w:t>
-      </w:r>
-    </w:p>
-    <w:p>
-      <w:pPr>
-        <w:rPr>
-          <w:sz w:val="40"/>
-          <w:szCs w:val="40"/>
-        </w:rPr>
-      </w:pPr>
-      <w:proofErr w:type="spellStart"/>
-      <w:r>
-        <w:rPr>
-          <w:sz w:val="40"/>
-          <w:szCs w:val="40"/>
-        </w:rPr>
-        <w:t>it</w:t>
-      </w:r>
-      <w:proofErr w:type="spellEnd"/>
-      <w:r>
-        <w:rPr>
-          <w:sz w:val="40"/>
-          <w:szCs w:val="40"/>
-        </w:rPr>
-        <w:t xml:space="preserve"> = (-2+</w:t>
-      </w:r>
-      <w:proofErr w:type="gramStart"/>
-      <w:r>
-        <w:rPr>
-          <w:sz w:val="40"/>
-          <w:szCs w:val="40"/>
-        </w:rPr>
-        <w:t>2)*</w:t>
-      </w:r>
-      <w:proofErr w:type="gramEnd"/>
-      <w:r>
-        <w:rPr>
-          <w:sz w:val="40"/>
-          <w:szCs w:val="40"/>
-        </w:rPr>
-        <w:t>2</w:t>
-      </w:r>
-      <w:proofErr w:type="gramStart"/>
-      <w:r>
-        <w:rPr>
-          <w:sz w:val="40"/>
-          <w:szCs w:val="40"/>
-        </w:rPr>
-        <w:t>=(0)*</w:t>
-      </w:r>
-      <w:proofErr w:type="gramEnd"/>
-      <w:r>
-        <w:rPr>
-          <w:sz w:val="40"/>
-          <w:szCs w:val="40"/>
-        </w:rPr>
-        <w:t>2=0</w:t>
-      </w:r>
-    </w:p>
-    <w:p>
-      <w:pPr>
-        <w:rPr>
-          <w:sz w:val="40"/>
-          <w:szCs w:val="40"/>
-        </w:rPr>
-      </w:pPr>
-      <w:proofErr w:type="spellStart"/>
-      <w:r>
-        <w:rPr>
-          <w:sz w:val="40"/>
-          <w:szCs w:val="40"/>
-        </w:rPr>
-        <w:t>it</w:t>
-      </w:r>
-      <w:proofErr w:type="spellEnd"/>
-      <w:r>
-        <w:rPr>
-          <w:sz w:val="40"/>
-          <w:szCs w:val="40"/>
-        </w:rPr>
-        <w:t xml:space="preserve"> = (-2+</w:t>
-      </w:r>
-      <w:proofErr w:type="gramStart"/>
-      <w:r>
-        <w:rPr>
-          <w:sz w:val="40"/>
-          <w:szCs w:val="40"/>
-        </w:rPr>
-        <w:t>3)*</w:t>
-      </w:r>
-      <w:proofErr w:type="gramEnd"/>
-      <w:r>
-        <w:rPr>
-          <w:sz w:val="40"/>
-          <w:szCs w:val="40"/>
-        </w:rPr>
-        <w:t>3</w:t>
-      </w:r>
-      <w:proofErr w:type="gramStart"/>
-      <w:r>
-        <w:rPr>
-          <w:sz w:val="40"/>
-          <w:szCs w:val="40"/>
-        </w:rPr>
-        <w:t>=(1)*</w:t>
-      </w:r>
-      <w:proofErr w:type="gramEnd"/>
-      <w:r>
-        <w:rPr>
-          <w:sz w:val="40"/>
-          <w:szCs w:val="40"/>
+          <w:lang w:val="en-US"/>
         </w:rPr>
         <w:t>3=3</w:t>
       </w:r>
@@ -720,7 +739,23 @@
           <w:sz w:val="40"/>
           <w:szCs w:val="40"/>
         </w:rPr>
-        <w:t xml:space="preserve"> ejercicios pero esos los </w:t>
+        <w:t xml:space="preserve"> </w:t>
+      </w:r>
+      <w:proofErr w:type="gramStart"/>
+      <w:r>
+        <w:rPr>
+          <w:sz w:val="40"/>
+          <w:szCs w:val="40"/>
+        </w:rPr>
+        <w:t>ejercicios</w:t>
+      </w:r>
+      <w:proofErr w:type="gramEnd"/>
+      <w:r>
+        <w:rPr>
+          <w:sz w:val="40"/>
+          <w:szCs w:val="40"/>
+        </w:rPr>
+        <w:t xml:space="preserve"> pero esos los </w:t>
       </w:r>
       <w:proofErr w:type="spellStart"/>
       <w:r>
@@ -737,6 +772,418 @@
           <w:szCs w:val="40"/>
         </w:rPr>
         <w:t xml:space="preserve"> en el cuaderno </w:t>
+      </w:r>
+    </w:p>
+    <w:p>
+      <w:pPr>
+        <w:rPr>
+          <w:sz w:val="40"/>
+          <w:szCs w:val="40"/>
+        </w:rPr>
+      </w:pPr>
+    </w:p>
+    <w:p>
+      <w:pPr>
+        <w:rPr>
+          <w:sz w:val="40"/>
+          <w:szCs w:val="40"/>
+        </w:rPr>
+      </w:pPr>
+    </w:p>
+    <w:p>
+      <w:pPr>
+        <w:rPr>
+          <w:sz w:val="40"/>
+          <w:szCs w:val="40"/>
+        </w:rPr>
+      </w:pPr>
+    </w:p>
+    <w:p>
+      <w:pPr>
+        <w:rPr>
+          <w:sz w:val="40"/>
+          <w:szCs w:val="40"/>
+        </w:rPr>
+      </w:pPr>
+    </w:p>
+    <w:p>
+      <w:pPr>
+        <w:rPr>
+          <w:sz w:val="40"/>
+          <w:szCs w:val="40"/>
+        </w:rPr>
+      </w:pPr>
+    </w:p>
+    <w:p>
+      <w:pPr>
+        <w:rPr>
+          <w:sz w:val="40"/>
+          <w:szCs w:val="40"/>
+        </w:rPr>
+      </w:pPr>
+    </w:p>
+    <w:p>
+      <w:pPr>
+        <w:rPr>
+          <w:sz w:val="40"/>
+          <w:szCs w:val="40"/>
+        </w:rPr>
+      </w:pPr>
+    </w:p>
+    <w:p>
+      <w:pPr>
+        <w:rPr>
+          <w:sz w:val="40"/>
+          <w:szCs w:val="40"/>
+        </w:rPr>
+      </w:pPr>
+    </w:p>
+    <w:p>
+      <w:pPr>
+        <w:rPr>
+          <w:sz w:val="40"/>
+          <w:szCs w:val="40"/>
+        </w:rPr>
+      </w:pPr>
+    </w:p>
+    <w:p>
+      <w:pPr>
+        <w:rPr>
+          <w:sz w:val="40"/>
+          <w:szCs w:val="40"/>
+        </w:rPr>
+      </w:pPr>
+    </w:p>
+    <w:p>
+      <w:pPr>
+        <w:rPr>
+          <w:sz w:val="40"/>
+          <w:szCs w:val="40"/>
+        </w:rPr>
+      </w:pPr>
+    </w:p>
+    <w:p>
+      <w:pPr>
+        <w:rPr>
+          <w:sz w:val="40"/>
+          <w:szCs w:val="40"/>
+        </w:rPr>
+      </w:pPr>
+    </w:p>
+    <w:p>
+      <w:pPr>
+        <w:rPr>
+          <w:sz w:val="40"/>
+          <w:szCs w:val="40"/>
+        </w:rPr>
+      </w:pPr>
+    </w:p>
+    <w:p>
+      <w:pPr>
+        <w:rPr>
+          <w:sz w:val="40"/>
+          <w:szCs w:val="40"/>
+        </w:rPr>
+      </w:pPr>
+      <w:r>
+        <w:rPr>
+          <w:sz w:val="40"/>
+          <w:szCs w:val="40"/>
+        </w:rPr>
+        <w:lastRenderedPageBreak/>
+        <w:t xml:space="preserve">Lo que vimos el </w:t>
+      </w:r>
+      <w:r>
+        <w:rPr>
+          <w:sz w:val="40"/>
+          <w:szCs w:val="40"/>
+        </w:rPr>
+        <w:t>día</w:t>
+      </w:r>
+      <w:r>
+        <w:rPr>
+          <w:sz w:val="40"/>
+          <w:szCs w:val="40"/>
+        </w:rPr>
+        <w:t xml:space="preserve"> martes</w:t>
+      </w:r>
+      <w:r>
+        <w:rPr>
+          <w:sz w:val="40"/>
+          <w:szCs w:val="40"/>
+        </w:rPr>
+        <w:t xml:space="preserve"> </w:t>
+      </w:r>
+      <w:r>
+        <w:rPr>
+          <w:sz w:val="40"/>
+          <w:szCs w:val="40"/>
+        </w:rPr>
+        <w:t xml:space="preserve">nuestro maestro nos </w:t>
+      </w:r>
+      <w:r>
+        <w:rPr>
+          <w:sz w:val="40"/>
+          <w:szCs w:val="40"/>
+        </w:rPr>
+        <w:t>contó</w:t>
+      </w:r>
+      <w:r>
+        <w:rPr>
+          <w:sz w:val="40"/>
+          <w:szCs w:val="40"/>
+        </w:rPr>
+        <w:t xml:space="preserve"> que ya debíamos </w:t>
+      </w:r>
+      <w:r>
+        <w:rPr>
+          <w:sz w:val="40"/>
+          <w:szCs w:val="40"/>
+        </w:rPr>
+        <w:t xml:space="preserve">empezar </w:t>
+      </w:r>
+      <w:r>
+        <w:rPr>
+          <w:sz w:val="40"/>
+          <w:szCs w:val="40"/>
+        </w:rPr>
+        <w:t xml:space="preserve">a pensar sobre nuestro proyecto </w:t>
+      </w:r>
+      <w:r>
+        <w:rPr>
+          <w:sz w:val="40"/>
+          <w:szCs w:val="40"/>
+        </w:rPr>
+        <w:t xml:space="preserve">y nos dio ideas para poder plantearnos el como o de que </w:t>
+      </w:r>
+      <w:r>
+        <w:rPr>
+          <w:sz w:val="40"/>
+          <w:szCs w:val="40"/>
+        </w:rPr>
+        <w:t>trataría.</w:t>
+      </w:r>
+    </w:p>
+    <w:p>
+      <w:pPr>
+        <w:rPr>
+          <w:sz w:val="40"/>
+          <w:szCs w:val="40"/>
+        </w:rPr>
+      </w:pPr>
+      <w:r>
+        <w:rPr>
+          <w:sz w:val="40"/>
+          <w:szCs w:val="40"/>
+        </w:rPr>
+        <w:t>El nos conto</w:t>
+      </w:r>
+      <w:r>
+        <w:rPr>
+          <w:sz w:val="40"/>
+          <w:szCs w:val="40"/>
+        </w:rPr>
+        <w:t xml:space="preserve"> que nuestro proyecto podía tratar so</w:t>
+      </w:r>
+      <w:r>
+        <w:rPr>
+          <w:sz w:val="40"/>
+          <w:szCs w:val="40"/>
+        </w:rPr>
+        <w:t>b</w:t>
+      </w:r>
+      <w:r>
+        <w:rPr>
+          <w:sz w:val="40"/>
+          <w:szCs w:val="40"/>
+        </w:rPr>
+        <w:t>re un</w:t>
+      </w:r>
+      <w:r>
+        <w:rPr>
+          <w:sz w:val="40"/>
+          <w:szCs w:val="40"/>
+        </w:rPr>
+        <w:t xml:space="preserve"> programa basado en un</w:t>
+      </w:r>
+      <w:r>
+        <w:rPr>
+          <w:sz w:val="40"/>
+          <w:szCs w:val="40"/>
+        </w:rPr>
+        <w:t xml:space="preserve"> </w:t>
+      </w:r>
+      <w:proofErr w:type="spellStart"/>
+      <w:r>
+        <w:rPr>
+          <w:sz w:val="40"/>
+          <w:szCs w:val="40"/>
+        </w:rPr>
+        <w:t>chatbot</w:t>
+      </w:r>
+      <w:proofErr w:type="spellEnd"/>
+      <w:r>
+        <w:rPr>
+          <w:sz w:val="40"/>
+          <w:szCs w:val="40"/>
+        </w:rPr>
+        <w:t xml:space="preserve"> de </w:t>
+      </w:r>
+      <w:r>
+        <w:rPr>
+          <w:sz w:val="40"/>
+          <w:szCs w:val="40"/>
+        </w:rPr>
+        <w:t>una inteligencia artificial</w:t>
+      </w:r>
+      <w:r>
+        <w:rPr>
+          <w:sz w:val="40"/>
+          <w:szCs w:val="40"/>
+        </w:rPr>
+        <w:t xml:space="preserve"> a lo que yo entendí</w:t>
+      </w:r>
+    </w:p>
+    <w:p>
+      <w:pPr>
+        <w:rPr>
+          <w:sz w:val="40"/>
+          <w:szCs w:val="40"/>
+        </w:rPr>
+      </w:pPr>
+      <w:r>
+        <w:rPr>
+          <w:sz w:val="40"/>
+          <w:szCs w:val="40"/>
+        </w:rPr>
+        <w:t xml:space="preserve">Bueno nos conto que </w:t>
+      </w:r>
+      <w:r>
+        <w:rPr>
+          <w:sz w:val="40"/>
+          <w:szCs w:val="40"/>
+        </w:rPr>
+        <w:t>anotáramos</w:t>
+      </w:r>
+      <w:r>
+        <w:rPr>
+          <w:sz w:val="40"/>
+          <w:szCs w:val="40"/>
+        </w:rPr>
+        <w:t xml:space="preserve"> </w:t>
+      </w:r>
+      <w:r>
+        <w:rPr>
+          <w:sz w:val="40"/>
+          <w:szCs w:val="40"/>
+        </w:rPr>
+        <w:t xml:space="preserve">la idea del nuestro y lo </w:t>
+      </w:r>
+      <w:r>
+        <w:rPr>
+          <w:sz w:val="40"/>
+          <w:szCs w:val="40"/>
+        </w:rPr>
+        <w:t>dialogáremos</w:t>
+      </w:r>
+      <w:r>
+        <w:rPr>
+          <w:sz w:val="40"/>
+          <w:szCs w:val="40"/>
+        </w:rPr>
+        <w:t xml:space="preserve"> con nuestros compañeros y </w:t>
+      </w:r>
+      <w:r>
+        <w:rPr>
+          <w:sz w:val="40"/>
+          <w:szCs w:val="40"/>
+        </w:rPr>
+        <w:t xml:space="preserve">cada quien se levanto a preguntarle a un compañero </w:t>
+      </w:r>
+      <w:r>
+        <w:rPr>
+          <w:sz w:val="40"/>
+          <w:szCs w:val="40"/>
+        </w:rPr>
+        <w:t xml:space="preserve">mínimo tener </w:t>
+      </w:r>
+      <w:r>
+        <w:rPr>
+          <w:sz w:val="40"/>
+          <w:szCs w:val="40"/>
+        </w:rPr>
+        <w:t xml:space="preserve">5 </w:t>
+      </w:r>
+      <w:r>
+        <w:rPr>
+          <w:sz w:val="40"/>
+          <w:szCs w:val="40"/>
+        </w:rPr>
+        <w:t>proyectos</w:t>
+      </w:r>
+      <w:r>
+        <w:rPr>
+          <w:sz w:val="40"/>
+          <w:szCs w:val="40"/>
+        </w:rPr>
+        <w:t xml:space="preserve"> y preguntarle además al compañero </w:t>
+      </w:r>
+      <w:r>
+        <w:rPr>
+          <w:sz w:val="40"/>
+          <w:szCs w:val="40"/>
+        </w:rPr>
+        <w:t xml:space="preserve">el </w:t>
+      </w:r>
+      <w:r>
+        <w:rPr>
+          <w:sz w:val="40"/>
+          <w:szCs w:val="40"/>
+        </w:rPr>
+        <w:t>por qué</w:t>
+      </w:r>
+      <w:r>
+        <w:rPr>
+          <w:sz w:val="40"/>
+          <w:szCs w:val="40"/>
+        </w:rPr>
+        <w:t xml:space="preserve"> quiso hacer o plantear ese </w:t>
+      </w:r>
+      <w:r>
+        <w:rPr>
+          <w:sz w:val="40"/>
+          <w:szCs w:val="40"/>
+        </w:rPr>
+        <w:t>proyecto</w:t>
+      </w:r>
+    </w:p>
+    <w:p>
+      <w:pPr>
+        <w:rPr>
+          <w:sz w:val="40"/>
+          <w:szCs w:val="40"/>
+        </w:rPr>
+      </w:pPr>
+      <w:r>
+        <w:rPr>
+          <w:sz w:val="40"/>
+          <w:szCs w:val="40"/>
+        </w:rPr>
+        <w:t xml:space="preserve">Cada proyecto tenia que tener </w:t>
+      </w:r>
+      <w:r>
+        <w:rPr>
+          <w:sz w:val="40"/>
+          <w:szCs w:val="40"/>
+        </w:rPr>
+        <w:t xml:space="preserve">limitaciones que eran = </w:t>
+      </w:r>
+      <w:r>
+        <w:rPr>
+          <w:sz w:val="40"/>
+          <w:szCs w:val="40"/>
+        </w:rPr>
+        <w:t>viabilidad, escalabilidad y recursos</w:t>
       </w:r>
     </w:p>
     <w:sectPr>
@@ -747,6 +1194,35 @@
     </w:sectPr>
   </w:body>
 </w:document>
+</file>
+
+<file path=word/numbering.xml><?xml version="1.0" encoding="utf-8"?>
+<w:numbering xmlns:wpc="http://schemas.microsoft.com/office/word/2010/wordprocessingCanvas" xmlns:cx="http://schemas.microsoft.com/office/drawing/2014/chartex" xmlns:cx1="http://schemas.microsoft.com/office/drawing/2015/9/8/chartex" xmlns:cx2="http://schemas.microsoft.com/office/drawing/2015/10/21/chartex" xmlns:cx3="http://schemas.microsoft.com/office/drawing/2016/5/9/chartex" xmlns:cx4="http://schemas.microsoft.com/office/drawing/2016/5/10/chartex" xmlns:cx5="http://schemas.microsoft.com/office/drawing/2016/5/11/chartex" xmlns:cx6="http://schemas.microsoft.com/office/drawing/2016/5/12/chartex" xmlns:cx7="http://schemas.microsoft.com/office/drawing/2016/5/13/chartex" xmlns:cx8="http://schemas.microsoft.com/office/drawing/2016/5/14/chartex" xmlns:mc="http://schemas.openxmlformats.org/markup-compatibility/2006" xmlns:aink="http://schemas.microsoft.com/office/drawing/2016/ink" xmlns:am3d="http://schemas.microsoft.com/office/drawing/2017/model3d" xmlns:o="urn:schemas-microsoft-com:office:office" xmlns:oel="http://schemas.microsoft.com/office/2019/extlst" xmlns:r="http://schemas.openxmlformats.org/officeDocument/2006/relationships" xmlns:m="http://schemas.openxmlformats.org/officeDocument/2006/math" xmlns:v="urn:schemas-microsoft-com:vml" xmlns:wp14="http://schemas.microsoft.com/office/word/2010/wordprocessingDrawing" xmlns:wp="http://schemas.openxmlformats.org/drawingml/2006/wordprocessingDrawing" xmlns:w10="urn:schemas-microsoft-com:office:word" xmlns:w="http://schemas.openxmlformats.org/wordprocessingml/2006/main" xmlns:w14="http://schemas.microsoft.com/office/word/2010/wordml" xmlns:w15="http://schemas.microsoft.com/office/word/2012/wordml" xmlns:w16cex="http://schemas.microsoft.com/office/word/2018/wordml/cex" xmlns:w16cid="http://schemas.microsoft.com/office/word/2016/wordml/cid" xmlns:w16="http://schemas.microsoft.com/office/word/2018/wordml" xmlns:w16du="http://schemas.microsoft.com/office/word/2023/wordml/word16du" xmlns:w16sdtdh="http://schemas.microsoft.com/office/word/2020/wordml/sdtdatahash" xmlns:w16sdtfl="http://schemas.microsoft.com/office/word/2024/wordml/sdtformatlock" xmlns:w16se="http://schemas.microsoft.com/office/word/2015/wordml/symex" xmlns:wpg="http://schemas.microsoft.com/office/word/2010/wordprocessingGroup" xmlns:wpi="http://schemas.microsoft.com/office/word/2010/wordprocessingInk" xmlns:wne="http://schemas.microsoft.com/office/word/2006/wordml" xmlns:wps="http://schemas.microsoft.com/office/word/2010/wordprocessingShape" mc:Ignorable="w14 w15 w16se w16cid w16 w16cex w16sdtdh w16sdtfl w16du wp14">
+  <w:abstractNum w:abstractNumId="0" w15:restartNumberingAfterBreak="0">
+    <w:nsid w:val="FFFFFF83"/>
+    <w:multiLevelType w:val="singleLevel"/>
+    <w:tmpl w:val="42A65DD2"/>
+    <w:lvl w:ilvl="0">
+      <w:start w:val="1"/>
+      <w:numFmt w:val="bullet"/>
+      <w:pStyle w:val="Listaconvietas2"/>
+      <w:lvlText w:val=""/>
+      <w:lvlJc w:val="left"/>
+      <w:pPr>
+        <w:tabs>
+          <w:tab w:val="num" w:pos="643"/>
+        </w:tabs>
+        <w:ind w:left="643" w:hanging="360"/>
+      </w:pPr>
+      <w:rPr>
+        <w:rFonts w:ascii="Symbol" w:hAnsi="Symbol" w:hint="default"/>
+      </w:rPr>
+    </w:lvl>
+  </w:abstractNum>
+  <w:num w:numId="1" w16cid:durableId="1972785104">
+    <w:abstractNumId w:val="0"/>
+  </w:num>
+</w:numbering>
 </file>
 
 <file path=word/styles.xml><?xml version="1.0" encoding="utf-8"?>
@@ -1666,6 +2142,48 @@
       <w:spacing w:val="5"/>
     </w:rPr>
   </w:style>
+  <w:style w:type="paragraph" w:styleId="Lista">
+    <w:name w:val="List"/>
+    <w:basedOn w:val="Normal"/>
+    <w:uiPriority w:val="99"/>
+    <w:unhideWhenUsed/>
+    <w:rsid w:val="009E3C4E"/>
+    <w:pPr>
+      <w:ind w:left="283" w:hanging="283"/>
+      <w:contextualSpacing/>
+    </w:pPr>
+  </w:style>
+  <w:style w:type="paragraph" w:styleId="Listaconvietas2">
+    <w:name w:val="List Bullet 2"/>
+    <w:basedOn w:val="Normal"/>
+    <w:uiPriority w:val="99"/>
+    <w:unhideWhenUsed/>
+    <w:rsid w:val="009E3C4E"/>
+    <w:pPr>
+      <w:numPr>
+        <w:numId w:val="1"/>
+      </w:numPr>
+      <w:contextualSpacing/>
+    </w:pPr>
+  </w:style>
+  <w:style w:type="paragraph" w:styleId="Textoindependiente">
+    <w:name w:val="Body Text"/>
+    <w:basedOn w:val="Normal"/>
+    <w:link w:val="TextoindependienteCar"/>
+    <w:uiPriority w:val="99"/>
+    <w:unhideWhenUsed/>
+    <w:rsid w:val="009E3C4E"/>
+    <w:pPr>
+      <w:spacing w:after="120"/>
+    </w:pPr>
+  </w:style>
+  <w:style w:type="character" w:customStyle="1" w:styleId="TextoindependienteCar">
+    <w:name w:val="Texto independiente Car"/>
+    <w:basedOn w:val="Fuentedeprrafopredeter"/>
+    <w:link w:val="Textoindependiente"/>
+    <w:uiPriority w:val="99"/>
+    <w:rsid w:val="009E3C4E"/>
+  </w:style>
 </w:styles>
 </file>
 

</xml_diff>

<commit_message>
seleccion de tema de proyecto en equipo y la estructura del anteproyecto.
</commit_message>
<xml_diff>
--- a/Lo que vimos en la semana              lunes.docx
+++ b/Lo que vimos en la semana              lunes.docx
@@ -1184,6 +1184,432 @@
           <w:szCs w:val="40"/>
         </w:rPr>
         <w:t>viabilidad, escalabilidad y recursos</w:t>
+      </w:r>
+    </w:p>
+    <w:p>
+      <w:pPr>
+        <w:rPr>
+          <w:sz w:val="40"/>
+          <w:szCs w:val="40"/>
+        </w:rPr>
+      </w:pPr>
+    </w:p>
+    <w:p>
+      <w:pPr>
+        <w:rPr>
+          <w:sz w:val="40"/>
+          <w:szCs w:val="40"/>
+        </w:rPr>
+      </w:pPr>
+    </w:p>
+    <w:p>
+      <w:pPr>
+        <w:rPr>
+          <w:sz w:val="40"/>
+          <w:szCs w:val="40"/>
+        </w:rPr>
+      </w:pPr>
+    </w:p>
+    <w:p>
+      <w:pPr>
+        <w:rPr>
+          <w:sz w:val="40"/>
+          <w:szCs w:val="40"/>
+        </w:rPr>
+      </w:pPr>
+    </w:p>
+    <w:p>
+      <w:pPr>
+        <w:rPr>
+          <w:sz w:val="40"/>
+          <w:szCs w:val="40"/>
+        </w:rPr>
+      </w:pPr>
+    </w:p>
+    <w:p>
+      <w:pPr>
+        <w:rPr>
+          <w:sz w:val="40"/>
+          <w:szCs w:val="40"/>
+        </w:rPr>
+      </w:pPr>
+      <w:r>
+        <w:rPr>
+          <w:sz w:val="40"/>
+          <w:szCs w:val="40"/>
+        </w:rPr>
+        <w:lastRenderedPageBreak/>
+        <w:t xml:space="preserve">El </w:t>
+      </w:r>
+      <w:r>
+        <w:rPr>
+          <w:sz w:val="40"/>
+          <w:szCs w:val="40"/>
+        </w:rPr>
+        <w:t>día</w:t>
+      </w:r>
+      <w:r>
+        <w:rPr>
+          <w:sz w:val="40"/>
+          <w:szCs w:val="40"/>
+        </w:rPr>
+        <w:t xml:space="preserve"> jueves retomamos lo del martes sobre lo de nuestros proyectos y nos plantearemos bien </w:t>
+      </w:r>
+      <w:proofErr w:type="gramStart"/>
+      <w:r>
+        <w:rPr>
+          <w:sz w:val="40"/>
+          <w:szCs w:val="40"/>
+        </w:rPr>
+        <w:t>de que</w:t>
+      </w:r>
+      <w:proofErr w:type="gramEnd"/>
+      <w:r>
+        <w:rPr>
+          <w:sz w:val="40"/>
+          <w:szCs w:val="40"/>
+        </w:rPr>
+        <w:t xml:space="preserve"> seria y nos dio 5 min para volver a parar a preguntar sobre 7 proyectos de nuestros compañeros y en que consistían ósea escribir primero el nombre del proyectó del compañero y de que </w:t>
+      </w:r>
+      <w:r>
+        <w:rPr>
+          <w:sz w:val="40"/>
+          <w:szCs w:val="40"/>
+        </w:rPr>
+        <w:t>trataba, después</w:t>
+      </w:r>
+      <w:r>
+        <w:rPr>
+          <w:sz w:val="40"/>
+          <w:szCs w:val="40"/>
+        </w:rPr>
+        <w:t xml:space="preserve"> que pasaron los 5 min nos</w:t>
+      </w:r>
+      <w:r>
+        <w:rPr>
+          <w:sz w:val="40"/>
+          <w:szCs w:val="40"/>
+        </w:rPr>
+        <w:t xml:space="preserve"> </w:t>
+      </w:r>
+      <w:proofErr w:type="spellStart"/>
+      <w:r>
+        <w:rPr>
+          <w:sz w:val="40"/>
+          <w:szCs w:val="40"/>
+        </w:rPr>
+        <w:t>conto</w:t>
+      </w:r>
+      <w:proofErr w:type="spellEnd"/>
+      <w:r>
+        <w:rPr>
+          <w:sz w:val="40"/>
+          <w:szCs w:val="40"/>
+        </w:rPr>
+        <w:t xml:space="preserve"> lo siguiente.</w:t>
+      </w:r>
+    </w:p>
+    <w:p>
+      <w:pPr>
+        <w:rPr>
+          <w:sz w:val="40"/>
+          <w:szCs w:val="40"/>
+        </w:rPr>
+      </w:pPr>
+      <w:r>
+        <w:rPr>
+          <w:sz w:val="40"/>
+          <w:szCs w:val="40"/>
+        </w:rPr>
+        <w:t xml:space="preserve">Ahora que ya teníamos mas conocimiento sobre otros proyectos nos digo que </w:t>
+      </w:r>
+      <w:r>
+        <w:rPr>
+          <w:sz w:val="40"/>
+          <w:szCs w:val="40"/>
+        </w:rPr>
+        <w:t>formáramos</w:t>
+      </w:r>
+      <w:r>
+        <w:rPr>
+          <w:sz w:val="40"/>
+          <w:szCs w:val="40"/>
+        </w:rPr>
+        <w:t xml:space="preserve"> equipos de 2 a 3 personas y que formando los equipos empezaríamos con  nuestro anteproyecto el cual </w:t>
+      </w:r>
+      <w:r>
+        <w:rPr>
+          <w:sz w:val="40"/>
+          <w:szCs w:val="40"/>
+        </w:rPr>
+        <w:t>consistía</w:t>
+      </w:r>
+      <w:r>
+        <w:rPr>
+          <w:sz w:val="40"/>
+          <w:szCs w:val="40"/>
+        </w:rPr>
+        <w:t xml:space="preserve"> en varios puntos importantes el primero era </w:t>
+      </w:r>
+      <w:proofErr w:type="spellStart"/>
+      <w:r>
+        <w:rPr>
+          <w:sz w:val="40"/>
+          <w:szCs w:val="40"/>
+        </w:rPr>
+        <w:t>titulo</w:t>
+      </w:r>
+      <w:proofErr w:type="spellEnd"/>
+      <w:r>
+        <w:rPr>
+          <w:sz w:val="40"/>
+          <w:szCs w:val="40"/>
+        </w:rPr>
+        <w:t>, después</w:t>
+      </w:r>
+      <w:r>
+        <w:rPr>
+          <w:sz w:val="40"/>
+          <w:szCs w:val="40"/>
+        </w:rPr>
+        <w:t xml:space="preserve"> el planteamiento del problema (1/2 cuartilla),de allí </w:t>
+      </w:r>
+      <w:r>
+        <w:rPr>
+          <w:sz w:val="40"/>
+          <w:szCs w:val="40"/>
+        </w:rPr>
+        <w:t>justificación</w:t>
+      </w:r>
+      <w:r>
+        <w:rPr>
+          <w:sz w:val="40"/>
+          <w:szCs w:val="40"/>
+        </w:rPr>
+        <w:t>(1/</w:t>
+      </w:r>
+      <w:r>
+        <w:rPr>
+          <w:sz w:val="40"/>
+          <w:szCs w:val="40"/>
+        </w:rPr>
+        <w:t>4</w:t>
+      </w:r>
+      <w:r>
+        <w:rPr>
+          <w:sz w:val="40"/>
+          <w:szCs w:val="40"/>
+        </w:rPr>
+        <w:t xml:space="preserve"> cuartilla)</w:t>
+      </w:r>
+      <w:r>
+        <w:rPr>
+          <w:sz w:val="40"/>
+          <w:szCs w:val="40"/>
+        </w:rPr>
+        <w:t>,hipótesis</w:t>
+      </w:r>
+      <w:r>
+        <w:rPr>
+          <w:sz w:val="40"/>
+          <w:szCs w:val="40"/>
+        </w:rPr>
+        <w:t>(1/</w:t>
+      </w:r>
+      <w:r>
+        <w:rPr>
+          <w:sz w:val="40"/>
+          <w:szCs w:val="40"/>
+        </w:rPr>
+        <w:t xml:space="preserve">4 </w:t>
+      </w:r>
+      <w:r>
+        <w:rPr>
+          <w:sz w:val="40"/>
+          <w:szCs w:val="40"/>
+        </w:rPr>
+        <w:t>cuartilla)</w:t>
+      </w:r>
+      <w:r>
+        <w:rPr>
+          <w:sz w:val="40"/>
+          <w:szCs w:val="40"/>
+        </w:rPr>
+        <w:t>,objetivos específicos y generales</w:t>
+      </w:r>
+      <w:r>
+        <w:rPr>
+          <w:sz w:val="40"/>
+          <w:szCs w:val="40"/>
+        </w:rPr>
+        <w:t>(1/2 cuartilla)</w:t>
+      </w:r>
+      <w:r>
+        <w:rPr>
+          <w:sz w:val="40"/>
+          <w:szCs w:val="40"/>
+        </w:rPr>
+        <w:t>,</w:t>
+      </w:r>
+      <w:r>
+        <w:rPr>
+          <w:sz w:val="40"/>
+          <w:szCs w:val="40"/>
+        </w:rPr>
+        <w:t>metodología</w:t>
+      </w:r>
+      <w:r>
+        <w:rPr>
+          <w:sz w:val="40"/>
+          <w:szCs w:val="40"/>
+        </w:rPr>
+        <w:t>(1/2 cuartilla)</w:t>
+      </w:r>
+      <w:r>
+        <w:rPr>
+          <w:sz w:val="40"/>
+          <w:szCs w:val="40"/>
+        </w:rPr>
+        <w:t>,</w:t>
+      </w:r>
+      <w:r>
+        <w:rPr>
+          <w:sz w:val="40"/>
+          <w:szCs w:val="40"/>
+        </w:rPr>
+        <w:t>experimentación</w:t>
+      </w:r>
+      <w:r>
+        <w:rPr>
+          <w:sz w:val="40"/>
+          <w:szCs w:val="40"/>
+        </w:rPr>
+        <w:t>(</w:t>
+      </w:r>
+      <w:r>
+        <w:rPr>
+          <w:sz w:val="40"/>
+          <w:szCs w:val="40"/>
+        </w:rPr>
+        <w:t xml:space="preserve">1/4 </w:t>
+      </w:r>
+      <w:r>
+        <w:rPr>
+          <w:sz w:val="40"/>
+          <w:szCs w:val="40"/>
+        </w:rPr>
+        <w:t>cuartilla)</w:t>
+      </w:r>
+      <w:r>
+        <w:rPr>
+          <w:sz w:val="40"/>
+          <w:szCs w:val="40"/>
+        </w:rPr>
+        <w:t>,análisis y discusiones</w:t>
+      </w:r>
+      <w:r>
+        <w:rPr>
+          <w:sz w:val="40"/>
+          <w:szCs w:val="40"/>
+        </w:rPr>
+        <w:t>(1/</w:t>
+      </w:r>
+      <w:r>
+        <w:rPr>
+          <w:sz w:val="40"/>
+          <w:szCs w:val="40"/>
+        </w:rPr>
+        <w:t>4</w:t>
+      </w:r>
+      <w:r>
+        <w:rPr>
+          <w:sz w:val="40"/>
+          <w:szCs w:val="40"/>
+        </w:rPr>
+        <w:t xml:space="preserve"> cuartilla)</w:t>
+      </w:r>
+      <w:r>
+        <w:rPr>
+          <w:sz w:val="40"/>
+          <w:szCs w:val="40"/>
+        </w:rPr>
+        <w:t xml:space="preserve"> y por </w:t>
+      </w:r>
+      <w:proofErr w:type="spellStart"/>
+      <w:r>
+        <w:rPr>
+          <w:sz w:val="40"/>
+          <w:szCs w:val="40"/>
+        </w:rPr>
+        <w:t>ultimo</w:t>
+      </w:r>
+      <w:proofErr w:type="spellEnd"/>
+      <w:r>
+        <w:rPr>
+          <w:sz w:val="40"/>
+          <w:szCs w:val="40"/>
+        </w:rPr>
+        <w:t xml:space="preserve"> la conclusión que </w:t>
+      </w:r>
+      <w:proofErr w:type="spellStart"/>
+      <w:r>
+        <w:rPr>
+          <w:sz w:val="40"/>
+          <w:szCs w:val="40"/>
+        </w:rPr>
+        <w:t>seria</w:t>
+      </w:r>
+      <w:proofErr w:type="spellEnd"/>
+      <w:r>
+        <w:rPr>
+          <w:sz w:val="40"/>
+          <w:szCs w:val="40"/>
+        </w:rPr>
+        <w:t xml:space="preserve"> </w:t>
+      </w:r>
+      <w:r>
+        <w:rPr>
+          <w:sz w:val="40"/>
+          <w:szCs w:val="40"/>
+        </w:rPr>
+        <w:t>(1/</w:t>
+      </w:r>
+      <w:r>
+        <w:rPr>
+          <w:sz w:val="40"/>
+          <w:szCs w:val="40"/>
+        </w:rPr>
+        <w:t xml:space="preserve">4 </w:t>
+      </w:r>
+      <w:r>
+        <w:rPr>
+          <w:sz w:val="40"/>
+          <w:szCs w:val="40"/>
+        </w:rPr>
+        <w:t>cuartilla)</w:t>
+      </w:r>
+      <w:r>
+        <w:rPr>
+          <w:sz w:val="40"/>
+          <w:szCs w:val="40"/>
+        </w:rPr>
+        <w:t xml:space="preserve"> dándonos un resultado de 2 ¾ de cuartilla.</w:t>
+      </w:r>
+    </w:p>
+    <w:p>
+      <w:pPr>
+        <w:rPr>
+          <w:sz w:val="40"/>
+          <w:szCs w:val="40"/>
+        </w:rPr>
+      </w:pPr>
+      <w:r>
+        <w:rPr>
+          <w:sz w:val="40"/>
+          <w:szCs w:val="40"/>
+        </w:rPr>
+        <w:lastRenderedPageBreak/>
+        <w:t xml:space="preserve">Mi equipo y yo al final decidimos hacerlo sobre un sistema sobre reconocimiento de detección de voces </w:t>
       </w:r>
     </w:p>
     <w:sectPr>

</xml_diff>

<commit_message>
comentamos acerca de que era la metodologia y analisis de cuantitativa/cualitativa.
</commit_message>
<xml_diff>
--- a/Lo que vimos en la semana              lunes.docx
+++ b/Lo que vimos en la semana              lunes.docx
@@ -436,23 +436,29 @@
         <w:rPr>
           <w:sz w:val="40"/>
           <w:szCs w:val="40"/>
-          <w:lang w:val="en-US"/>
-        </w:rPr>
-      </w:pPr>
-      <w:r>
-        <w:rPr>
-          <w:sz w:val="40"/>
-          <w:szCs w:val="40"/>
-          <w:lang w:val="en-US"/>
-        </w:rPr>
-        <w:t>it = (-2+</w:t>
+        </w:rPr>
+      </w:pPr>
+      <w:proofErr w:type="spellStart"/>
+      <w:r>
+        <w:rPr>
+          <w:sz w:val="40"/>
+          <w:szCs w:val="40"/>
+        </w:rPr>
+        <w:t>it</w:t>
+      </w:r>
+      <w:proofErr w:type="spellEnd"/>
+      <w:r>
+        <w:rPr>
+          <w:sz w:val="40"/>
+          <w:szCs w:val="40"/>
+        </w:rPr>
+        <w:t xml:space="preserve"> = (-2+</w:t>
       </w:r>
       <w:proofErr w:type="gramStart"/>
       <w:r>
         <w:rPr>
           <w:sz w:val="40"/>
           <w:szCs w:val="40"/>
-          <w:lang w:val="en-US"/>
         </w:rPr>
         <w:t>1)*</w:t>
       </w:r>
@@ -461,7 +467,6 @@
         <w:rPr>
           <w:sz w:val="40"/>
           <w:szCs w:val="40"/>
-          <w:lang w:val="en-US"/>
         </w:rPr>
         <w:t>1</w:t>
       </w:r>
@@ -470,7 +475,6 @@
         <w:rPr>
           <w:sz w:val="40"/>
           <w:szCs w:val="40"/>
-          <w:lang w:val="en-US"/>
         </w:rPr>
         <w:t>=(</w:t>
       </w:r>
@@ -479,7 +483,6 @@
         <w:rPr>
           <w:sz w:val="40"/>
           <w:szCs w:val="40"/>
-          <w:lang w:val="en-US"/>
         </w:rPr>
         <w:t>-</w:t>
       </w:r>
@@ -488,7 +491,6 @@
         <w:rPr>
           <w:sz w:val="40"/>
           <w:szCs w:val="40"/>
-          <w:lang w:val="en-US"/>
         </w:rPr>
         <w:t>1)*</w:t>
       </w:r>
@@ -497,7 +499,6 @@
         <w:rPr>
           <w:sz w:val="40"/>
           <w:szCs w:val="40"/>
-          <w:lang w:val="en-US"/>
         </w:rPr>
         <w:t>1=1</w:t>
       </w:r>
@@ -507,23 +508,29 @@
         <w:rPr>
           <w:sz w:val="40"/>
           <w:szCs w:val="40"/>
-          <w:lang w:val="en-US"/>
-        </w:rPr>
-      </w:pPr>
-      <w:r>
-        <w:rPr>
-          <w:sz w:val="40"/>
-          <w:szCs w:val="40"/>
-          <w:lang w:val="en-US"/>
-        </w:rPr>
-        <w:t>it = (-2+</w:t>
+        </w:rPr>
+      </w:pPr>
+      <w:proofErr w:type="spellStart"/>
+      <w:r>
+        <w:rPr>
+          <w:sz w:val="40"/>
+          <w:szCs w:val="40"/>
+        </w:rPr>
+        <w:t>it</w:t>
+      </w:r>
+      <w:proofErr w:type="spellEnd"/>
+      <w:r>
+        <w:rPr>
+          <w:sz w:val="40"/>
+          <w:szCs w:val="40"/>
+        </w:rPr>
+        <w:t xml:space="preserve"> = (-2+</w:t>
       </w:r>
       <w:proofErr w:type="gramStart"/>
       <w:r>
         <w:rPr>
           <w:sz w:val="40"/>
           <w:szCs w:val="40"/>
-          <w:lang w:val="en-US"/>
         </w:rPr>
         <w:t>2)*</w:t>
       </w:r>
@@ -532,7 +539,6 @@
         <w:rPr>
           <w:sz w:val="40"/>
           <w:szCs w:val="40"/>
-          <w:lang w:val="en-US"/>
         </w:rPr>
         <w:t>2</w:t>
       </w:r>
@@ -541,7 +547,6 @@
         <w:rPr>
           <w:sz w:val="40"/>
           <w:szCs w:val="40"/>
-          <w:lang w:val="en-US"/>
         </w:rPr>
         <w:t>=(0)*</w:t>
       </w:r>
@@ -550,7 +555,6 @@
         <w:rPr>
           <w:sz w:val="40"/>
           <w:szCs w:val="40"/>
-          <w:lang w:val="en-US"/>
         </w:rPr>
         <w:t>2=0</w:t>
       </w:r>
@@ -560,23 +564,29 @@
         <w:rPr>
           <w:sz w:val="40"/>
           <w:szCs w:val="40"/>
-          <w:lang w:val="en-US"/>
-        </w:rPr>
-      </w:pPr>
-      <w:r>
-        <w:rPr>
-          <w:sz w:val="40"/>
-          <w:szCs w:val="40"/>
-          <w:lang w:val="en-US"/>
-        </w:rPr>
-        <w:t>it = (-2+</w:t>
+        </w:rPr>
+      </w:pPr>
+      <w:proofErr w:type="spellStart"/>
+      <w:r>
+        <w:rPr>
+          <w:sz w:val="40"/>
+          <w:szCs w:val="40"/>
+        </w:rPr>
+        <w:t>it</w:t>
+      </w:r>
+      <w:proofErr w:type="spellEnd"/>
+      <w:r>
+        <w:rPr>
+          <w:sz w:val="40"/>
+          <w:szCs w:val="40"/>
+        </w:rPr>
+        <w:t xml:space="preserve"> = (-2+</w:t>
       </w:r>
       <w:proofErr w:type="gramStart"/>
       <w:r>
         <w:rPr>
           <w:sz w:val="40"/>
           <w:szCs w:val="40"/>
-          <w:lang w:val="en-US"/>
         </w:rPr>
         <w:t>3)*</w:t>
       </w:r>
@@ -585,7 +595,6 @@
         <w:rPr>
           <w:sz w:val="40"/>
           <w:szCs w:val="40"/>
-          <w:lang w:val="en-US"/>
         </w:rPr>
         <w:t>3</w:t>
       </w:r>
@@ -594,7 +603,6 @@
         <w:rPr>
           <w:sz w:val="40"/>
           <w:szCs w:val="40"/>
-          <w:lang w:val="en-US"/>
         </w:rPr>
         <w:t>=(1)*</w:t>
       </w:r>
@@ -603,7 +611,6 @@
         <w:rPr>
           <w:sz w:val="40"/>
           <w:szCs w:val="40"/>
-          <w:lang w:val="en-US"/>
         </w:rPr>
         <w:t>3=3</w:t>
       </w:r>
@@ -1386,70 +1393,7 @@
           <w:sz w:val="40"/>
           <w:szCs w:val="40"/>
         </w:rPr>
-        <w:t>(1/</w:t>
-      </w:r>
-      <w:r>
-        <w:rPr>
-          <w:sz w:val="40"/>
-          <w:szCs w:val="40"/>
-        </w:rPr>
-        <w:t>4</w:t>
-      </w:r>
-      <w:r>
-        <w:rPr>
-          <w:sz w:val="40"/>
-          <w:szCs w:val="40"/>
-        </w:rPr>
-        <w:t xml:space="preserve"> cuartilla)</w:t>
-      </w:r>
-      <w:r>
-        <w:rPr>
-          <w:sz w:val="40"/>
-          <w:szCs w:val="40"/>
-        </w:rPr>
-        <w:t>,hipótesis</w:t>
-      </w:r>
-      <w:r>
-        <w:rPr>
-          <w:sz w:val="40"/>
-          <w:szCs w:val="40"/>
-        </w:rPr>
-        <w:t>(1/</w:t>
-      </w:r>
-      <w:r>
-        <w:rPr>
-          <w:sz w:val="40"/>
-          <w:szCs w:val="40"/>
-        </w:rPr>
-        <w:t xml:space="preserve">4 </w:t>
-      </w:r>
-      <w:r>
-        <w:rPr>
-          <w:sz w:val="40"/>
-          <w:szCs w:val="40"/>
-        </w:rPr>
-        <w:t>cuartilla)</w:t>
-      </w:r>
-      <w:r>
-        <w:rPr>
-          <w:sz w:val="40"/>
-          <w:szCs w:val="40"/>
-        </w:rPr>
-        <w:t>,objetivos específicos y generales</w:t>
-      </w:r>
-      <w:r>
-        <w:rPr>
-          <w:sz w:val="40"/>
-          <w:szCs w:val="40"/>
-        </w:rPr>
-        <w:t>(1/2 cuartilla)</w:t>
-      </w:r>
-      <w:r>
-        <w:rPr>
-          <w:sz w:val="40"/>
-          <w:szCs w:val="40"/>
-        </w:rPr>
-        <w:t>,</w:t>
+        <w:t>(1/4 cuartilla),hipótesis(1/4 cuartilla),objetivos específicos y generales(1/2 cuartilla),</w:t>
       </w:r>
       <w:r>
         <w:rPr>
@@ -1463,14 +1407,7 @@
           <w:sz w:val="40"/>
           <w:szCs w:val="40"/>
         </w:rPr>
-        <w:t>(1/2 cuartilla)</w:t>
-      </w:r>
-      <w:r>
-        <w:rPr>
-          <w:sz w:val="40"/>
-          <w:szCs w:val="40"/>
-        </w:rPr>
-        <w:t>,</w:t>
+        <w:t>(1/2 cuartilla),</w:t>
       </w:r>
       <w:r>
         <w:rPr>
@@ -1498,42 +1435,7 @@
           <w:sz w:val="40"/>
           <w:szCs w:val="40"/>
         </w:rPr>
-        <w:t>cuartilla)</w:t>
-      </w:r>
-      <w:r>
-        <w:rPr>
-          <w:sz w:val="40"/>
-          <w:szCs w:val="40"/>
-        </w:rPr>
-        <w:t>,análisis y discusiones</w:t>
-      </w:r>
-      <w:r>
-        <w:rPr>
-          <w:sz w:val="40"/>
-          <w:szCs w:val="40"/>
-        </w:rPr>
-        <w:t>(1/</w:t>
-      </w:r>
-      <w:r>
-        <w:rPr>
-          <w:sz w:val="40"/>
-          <w:szCs w:val="40"/>
-        </w:rPr>
-        <w:t>4</w:t>
-      </w:r>
-      <w:r>
-        <w:rPr>
-          <w:sz w:val="40"/>
-          <w:szCs w:val="40"/>
-        </w:rPr>
-        <w:t xml:space="preserve"> cuartilla)</w:t>
-      </w:r>
-      <w:r>
-        <w:rPr>
-          <w:sz w:val="40"/>
-          <w:szCs w:val="40"/>
-        </w:rPr>
-        <w:t xml:space="preserve"> y por </w:t>
+        <w:t xml:space="preserve">cuartilla),análisis y discusiones(1/4 cuartilla) y por </w:t>
       </w:r>
       <w:proofErr w:type="spellStart"/>
       <w:r>
@@ -1565,28 +1467,7 @@
           <w:sz w:val="40"/>
           <w:szCs w:val="40"/>
         </w:rPr>
-        <w:t xml:space="preserve"> </w:t>
-      </w:r>
-      <w:r>
-        <w:rPr>
-          <w:sz w:val="40"/>
-          <w:szCs w:val="40"/>
-        </w:rPr>
-        <w:t>(1/</w:t>
-      </w:r>
-      <w:r>
-        <w:rPr>
-          <w:sz w:val="40"/>
-          <w:szCs w:val="40"/>
-        </w:rPr>
-        <w:t xml:space="preserve">4 </w:t>
-      </w:r>
-      <w:r>
-        <w:rPr>
-          <w:sz w:val="40"/>
-          <w:szCs w:val="40"/>
-        </w:rPr>
-        <w:t>cuartilla)</w:t>
+        <w:t xml:space="preserve"> (1/4 cuartilla)</w:t>
       </w:r>
       <w:r>
         <w:rPr>
@@ -1610,6 +1491,377 @@
         </w:rPr>
         <w:lastRenderedPageBreak/>
         <w:t xml:space="preserve">Mi equipo y yo al final decidimos hacerlo sobre un sistema sobre reconocimiento de detección de voces </w:t>
+      </w:r>
+    </w:p>
+    <w:p>
+      <w:pPr>
+        <w:rPr>
+          <w:sz w:val="40"/>
+          <w:szCs w:val="40"/>
+        </w:rPr>
+      </w:pPr>
+    </w:p>
+    <w:p>
+      <w:pPr>
+        <w:rPr>
+          <w:sz w:val="40"/>
+          <w:szCs w:val="40"/>
+        </w:rPr>
+      </w:pPr>
+    </w:p>
+    <w:p>
+      <w:pPr>
+        <w:rPr>
+          <w:sz w:val="40"/>
+          <w:szCs w:val="40"/>
+        </w:rPr>
+      </w:pPr>
+    </w:p>
+    <w:p>
+      <w:pPr>
+        <w:rPr>
+          <w:sz w:val="40"/>
+          <w:szCs w:val="40"/>
+        </w:rPr>
+      </w:pPr>
+    </w:p>
+    <w:p>
+      <w:pPr>
+        <w:rPr>
+          <w:sz w:val="40"/>
+          <w:szCs w:val="40"/>
+        </w:rPr>
+      </w:pPr>
+    </w:p>
+    <w:p>
+      <w:pPr>
+        <w:rPr>
+          <w:sz w:val="40"/>
+          <w:szCs w:val="40"/>
+        </w:rPr>
+      </w:pPr>
+    </w:p>
+    <w:p>
+      <w:pPr>
+        <w:rPr>
+          <w:sz w:val="40"/>
+          <w:szCs w:val="40"/>
+        </w:rPr>
+      </w:pPr>
+    </w:p>
+    <w:p>
+      <w:pPr>
+        <w:rPr>
+          <w:sz w:val="40"/>
+          <w:szCs w:val="40"/>
+        </w:rPr>
+      </w:pPr>
+    </w:p>
+    <w:p>
+      <w:pPr>
+        <w:rPr>
+          <w:sz w:val="40"/>
+          <w:szCs w:val="40"/>
+        </w:rPr>
+      </w:pPr>
+    </w:p>
+    <w:p>
+      <w:pPr>
+        <w:rPr>
+          <w:sz w:val="40"/>
+          <w:szCs w:val="40"/>
+        </w:rPr>
+      </w:pPr>
+    </w:p>
+    <w:p>
+      <w:pPr>
+        <w:rPr>
+          <w:sz w:val="40"/>
+          <w:szCs w:val="40"/>
+        </w:rPr>
+      </w:pPr>
+    </w:p>
+    <w:p>
+      <w:pPr>
+        <w:rPr>
+          <w:sz w:val="40"/>
+          <w:szCs w:val="40"/>
+        </w:rPr>
+      </w:pPr>
+    </w:p>
+    <w:p>
+      <w:pPr>
+        <w:rPr>
+          <w:sz w:val="40"/>
+          <w:szCs w:val="40"/>
+        </w:rPr>
+      </w:pPr>
+    </w:p>
+    <w:p>
+      <w:pPr>
+        <w:rPr>
+          <w:sz w:val="40"/>
+          <w:szCs w:val="40"/>
+        </w:rPr>
+      </w:pPr>
+    </w:p>
+    <w:p>
+      <w:pPr>
+        <w:rPr>
+          <w:sz w:val="40"/>
+          <w:szCs w:val="40"/>
+        </w:rPr>
+      </w:pPr>
+      <w:r>
+        <w:rPr>
+          <w:sz w:val="40"/>
+          <w:szCs w:val="40"/>
+        </w:rPr>
+        <w:t xml:space="preserve">                                                                                                   </w:t>
+      </w:r>
+      <w:r>
+        <w:rPr>
+          <w:sz w:val="40"/>
+          <w:szCs w:val="40"/>
+        </w:rPr>
+        <w:t xml:space="preserve">           </w:t>
+      </w:r>
+    </w:p>
+    <w:p>
+      <w:pPr>
+        <w:rPr>
+          <w:sz w:val="40"/>
+          <w:szCs w:val="40"/>
+        </w:rPr>
+      </w:pPr>
+      <w:r>
+        <w:rPr>
+          <w:sz w:val="40"/>
+          <w:szCs w:val="40"/>
+        </w:rPr>
+        <w:lastRenderedPageBreak/>
+        <w:t xml:space="preserve">Estructura de datos </w:t>
+      </w:r>
+      <w:r>
+        <w:rPr>
+          <w:sz w:val="40"/>
+          <w:szCs w:val="40"/>
+        </w:rPr>
+        <w:t xml:space="preserve">lo que vimos el </w:t>
+      </w:r>
+      <w:r>
+        <w:rPr>
+          <w:sz w:val="40"/>
+          <w:szCs w:val="40"/>
+        </w:rPr>
+        <w:t>día</w:t>
+      </w:r>
+      <w:r>
+        <w:rPr>
+          <w:sz w:val="40"/>
+          <w:szCs w:val="40"/>
+        </w:rPr>
+        <w:t xml:space="preserve"> martes 08 de septiembre.</w:t>
+      </w:r>
+    </w:p>
+    <w:p>
+      <w:pPr>
+        <w:rPr>
+          <w:sz w:val="40"/>
+          <w:szCs w:val="40"/>
+        </w:rPr>
+      </w:pPr>
+      <w:r>
+        <w:rPr>
+          <w:sz w:val="40"/>
+          <w:szCs w:val="40"/>
+        </w:rPr>
+        <w:t xml:space="preserve">Antes de retomar el martes el </w:t>
+      </w:r>
+      <w:r>
+        <w:rPr>
+          <w:sz w:val="40"/>
+          <w:szCs w:val="40"/>
+        </w:rPr>
+        <w:t>día</w:t>
+      </w:r>
+      <w:r>
+        <w:rPr>
+          <w:sz w:val="40"/>
+          <w:szCs w:val="40"/>
+        </w:rPr>
+        <w:t xml:space="preserve"> lunes entregamos nuestros trabajos de la semana pasada </w:t>
+      </w:r>
+      <w:r>
+        <w:rPr>
+          <w:sz w:val="40"/>
+          <w:szCs w:val="40"/>
+        </w:rPr>
+        <w:t xml:space="preserve">y todo salió bien </w:t>
+      </w:r>
+    </w:p>
+    <w:p>
+      <w:pPr>
+        <w:rPr>
+          <w:sz w:val="40"/>
+          <w:szCs w:val="40"/>
+        </w:rPr>
+      </w:pPr>
+      <w:r>
+        <w:rPr>
+          <w:sz w:val="40"/>
+          <w:szCs w:val="40"/>
+        </w:rPr>
+        <w:t xml:space="preserve">Bueno el </w:t>
+      </w:r>
+      <w:r>
+        <w:rPr>
+          <w:sz w:val="40"/>
+          <w:szCs w:val="40"/>
+        </w:rPr>
+        <w:t>día</w:t>
+      </w:r>
+      <w:r>
+        <w:rPr>
+          <w:sz w:val="40"/>
+          <w:szCs w:val="40"/>
+        </w:rPr>
+        <w:t xml:space="preserve"> martes </w:t>
+      </w:r>
+      <w:r>
+        <w:rPr>
+          <w:sz w:val="40"/>
+          <w:szCs w:val="40"/>
+        </w:rPr>
+        <w:t>sabemos que tanto como martes y jueves son los dos días con los que trabajaremos nuestros proyectos finales</w:t>
+      </w:r>
+      <w:r>
+        <w:rPr>
+          <w:sz w:val="40"/>
+          <w:szCs w:val="40"/>
+        </w:rPr>
+        <w:t xml:space="preserve">, ese </w:t>
+      </w:r>
+      <w:r>
+        <w:rPr>
+          <w:sz w:val="40"/>
+          <w:szCs w:val="40"/>
+        </w:rPr>
+        <w:t>día</w:t>
+      </w:r>
+      <w:r>
+        <w:rPr>
+          <w:sz w:val="40"/>
+          <w:szCs w:val="40"/>
+        </w:rPr>
+        <w:t xml:space="preserve"> </w:t>
+      </w:r>
+      <w:r>
+        <w:rPr>
+          <w:sz w:val="40"/>
+          <w:szCs w:val="40"/>
+        </w:rPr>
+        <w:t xml:space="preserve">nuestro profesor </w:t>
+      </w:r>
+      <w:r>
+        <w:rPr>
+          <w:sz w:val="40"/>
+          <w:szCs w:val="40"/>
+        </w:rPr>
+        <w:t>Héctor</w:t>
+      </w:r>
+      <w:r>
+        <w:rPr>
+          <w:sz w:val="40"/>
+          <w:szCs w:val="40"/>
+        </w:rPr>
+        <w:t xml:space="preserve"> nos </w:t>
+      </w:r>
+      <w:r>
+        <w:rPr>
+          <w:sz w:val="40"/>
+          <w:szCs w:val="40"/>
+        </w:rPr>
+        <w:t xml:space="preserve">explicaba lo que era la metodología  y también lo que </w:t>
+      </w:r>
+      <w:r>
+        <w:rPr>
+          <w:sz w:val="40"/>
+          <w:szCs w:val="40"/>
+        </w:rPr>
+        <w:t>sería</w:t>
+      </w:r>
+      <w:r>
+        <w:rPr>
+          <w:sz w:val="40"/>
+          <w:szCs w:val="40"/>
+        </w:rPr>
+        <w:t xml:space="preserve"> </w:t>
+      </w:r>
+      <w:r>
+        <w:rPr>
+          <w:sz w:val="40"/>
+          <w:szCs w:val="40"/>
+        </w:rPr>
+        <w:t xml:space="preserve">perspectiva cualitativa y cuantitativa por lo cual pregunto a algunos compañeros por estos términos lo cual </w:t>
+      </w:r>
+      <w:r>
+        <w:rPr>
+          <w:sz w:val="40"/>
+          <w:szCs w:val="40"/>
+        </w:rPr>
+        <w:t xml:space="preserve">dieron de ejemplos </w:t>
+      </w:r>
+      <w:r>
+        <w:rPr>
+          <w:sz w:val="40"/>
+          <w:szCs w:val="40"/>
+        </w:rPr>
+        <w:t xml:space="preserve">como los que serian </w:t>
+      </w:r>
+      <w:r>
+        <w:rPr>
+          <w:sz w:val="40"/>
+          <w:szCs w:val="40"/>
+        </w:rPr>
+        <w:t>de la cualitativa que es toco lo contable como(</w:t>
+      </w:r>
+      <w:proofErr w:type="spellStart"/>
+      <w:r>
+        <w:rPr>
+          <w:sz w:val="40"/>
+          <w:szCs w:val="40"/>
+        </w:rPr>
+        <w:t>Documentacion,</w:t>
+      </w:r>
+      <w:r>
+        <w:rPr>
+          <w:sz w:val="40"/>
+          <w:szCs w:val="40"/>
+        </w:rPr>
+        <w:t>Estadisticas,Experimentacion,E.</w:t>
+      </w:r>
+      <w:r>
+        <w:rPr>
+          <w:sz w:val="40"/>
+          <w:szCs w:val="40"/>
+        </w:rPr>
+        <w:t>t.c</w:t>
+      </w:r>
+      <w:proofErr w:type="spellEnd"/>
+      <w:r>
+        <w:rPr>
+          <w:sz w:val="40"/>
+          <w:szCs w:val="40"/>
+        </w:rPr>
+        <w:t>).</w:t>
+      </w:r>
+      <w:r>
+        <w:rPr>
+          <w:sz w:val="40"/>
+          <w:szCs w:val="40"/>
+        </w:rPr>
+        <w:t xml:space="preserve">                                                                                                                       </w:t>
       </w:r>
     </w:p>
     <w:sectPr>

</xml_diff>

<commit_message>
cuestionario de metodologias de desarrollo y significado de SCRUM.
</commit_message>
<xml_diff>
--- a/Lo que vimos en la semana              lunes.docx
+++ b/Lo que vimos en la semana              lunes.docx
@@ -1782,7 +1782,23 @@
           <w:sz w:val="40"/>
           <w:szCs w:val="40"/>
         </w:rPr>
-        <w:t xml:space="preserve">explicaba lo que era la metodología  y también lo que </w:t>
+        <w:t xml:space="preserve">explicaba lo que era la </w:t>
+      </w:r>
+      <w:proofErr w:type="gramStart"/>
+      <w:r>
+        <w:rPr>
+          <w:sz w:val="40"/>
+          <w:szCs w:val="40"/>
+        </w:rPr>
+        <w:t>metodología  y</w:t>
+      </w:r>
+      <w:proofErr w:type="gramEnd"/>
+      <w:r>
+        <w:rPr>
+          <w:sz w:val="40"/>
+          <w:szCs w:val="40"/>
+        </w:rPr>
+        <w:t xml:space="preserve"> también lo que </w:t>
       </w:r>
       <w:r>
         <w:rPr>
@@ -1824,7 +1840,15 @@
           <w:sz w:val="40"/>
           <w:szCs w:val="40"/>
         </w:rPr>
-        <w:t>de la cualitativa que es toco lo contable como(</w:t>
+        <w:t xml:space="preserve">de la cualitativa que es toco lo contable </w:t>
+      </w:r>
+      <w:proofErr w:type="gramStart"/>
+      <w:r>
+        <w:rPr>
+          <w:sz w:val="40"/>
+          <w:szCs w:val="40"/>
+        </w:rPr>
+        <w:t>como(</w:t>
       </w:r>
       <w:proofErr w:type="spellStart"/>
       <w:r>
@@ -1839,7 +1863,31 @@
           <w:sz w:val="40"/>
           <w:szCs w:val="40"/>
         </w:rPr>
-        <w:t>Estadisticas,Experimentacion,E.</w:t>
+        <w:t>Estadisticas</w:t>
+      </w:r>
+      <w:proofErr w:type="gramEnd"/>
+      <w:r>
+        <w:rPr>
+          <w:sz w:val="40"/>
+          <w:szCs w:val="40"/>
+        </w:rPr>
+        <w:t>,</w:t>
+      </w:r>
+      <w:proofErr w:type="gramStart"/>
+      <w:r>
+        <w:rPr>
+          <w:sz w:val="40"/>
+          <w:szCs w:val="40"/>
+        </w:rPr>
+        <w:t>Experimentacion,E</w:t>
+      </w:r>
+      <w:proofErr w:type="gramEnd"/>
+      <w:r>
+        <w:rPr>
+          <w:sz w:val="40"/>
+          <w:szCs w:val="40"/>
+        </w:rPr>
+        <w:t>.</w:t>
       </w:r>
       <w:r>
         <w:rPr>
@@ -1861,7 +1909,163 @@
           <w:sz w:val="40"/>
           <w:szCs w:val="40"/>
         </w:rPr>
-        <w:t xml:space="preserve">                                                                                                                       </w:t>
+        <w:t xml:space="preserve">  </w:t>
+      </w:r>
+    </w:p>
+    <w:p>
+      <w:pPr>
+        <w:rPr>
+          <w:sz w:val="40"/>
+          <w:szCs w:val="40"/>
+        </w:rPr>
+      </w:pPr>
+    </w:p>
+    <w:p>
+      <w:pPr>
+        <w:rPr>
+          <w:sz w:val="40"/>
+          <w:szCs w:val="40"/>
+        </w:rPr>
+      </w:pPr>
+    </w:p>
+    <w:p>
+      <w:pPr>
+        <w:rPr>
+          <w:sz w:val="40"/>
+          <w:szCs w:val="40"/>
+        </w:rPr>
+      </w:pPr>
+    </w:p>
+    <w:p>
+      <w:pPr>
+        <w:rPr>
+          <w:sz w:val="40"/>
+          <w:szCs w:val="40"/>
+        </w:rPr>
+      </w:pPr>
+    </w:p>
+    <w:p>
+      <w:pPr>
+        <w:rPr>
+          <w:sz w:val="40"/>
+          <w:szCs w:val="40"/>
+        </w:rPr>
+      </w:pPr>
+    </w:p>
+    <w:p>
+      <w:pPr>
+        <w:rPr>
+          <w:sz w:val="40"/>
+          <w:szCs w:val="40"/>
+        </w:rPr>
+      </w:pPr>
+      <w:r>
+        <w:rPr>
+          <w:sz w:val="40"/>
+          <w:szCs w:val="40"/>
+        </w:rPr>
+        <w:lastRenderedPageBreak/>
+        <w:t>Ahora después de comentar lo que era metodología y análisis</w:t>
+      </w:r>
+      <w:r>
+        <w:rPr>
+          <w:sz w:val="40"/>
+          <w:szCs w:val="40"/>
+        </w:rPr>
+        <w:t xml:space="preserve"> </w:t>
+      </w:r>
+      <w:r>
+        <w:rPr>
+          <w:sz w:val="40"/>
+          <w:szCs w:val="40"/>
+        </w:rPr>
+        <w:t xml:space="preserve">de cuantitativas y cualitativas, después nuestro profesor nos pidió que formáramos nuestro equipo de 3 y contestáramos las siguientes preguntas(que era la metodología de </w:t>
+      </w:r>
+      <w:r>
+        <w:rPr>
+          <w:sz w:val="40"/>
+          <w:szCs w:val="40"/>
+        </w:rPr>
+        <w:t>investigación</w:t>
+      </w:r>
+      <w:r>
+        <w:rPr>
+          <w:sz w:val="40"/>
+          <w:szCs w:val="40"/>
+        </w:rPr>
+        <w:t xml:space="preserve"> 5 renglones, metodología de desarrollo de software</w:t>
+      </w:r>
+      <w:r>
+        <w:rPr>
+          <w:sz w:val="40"/>
+          <w:szCs w:val="40"/>
+        </w:rPr>
+        <w:t xml:space="preserve"> </w:t>
+      </w:r>
+      <w:r>
+        <w:rPr>
+          <w:sz w:val="40"/>
+          <w:szCs w:val="40"/>
+        </w:rPr>
+        <w:t>5 renglones</w:t>
+      </w:r>
+      <w:r>
+        <w:rPr>
+          <w:sz w:val="40"/>
+          <w:szCs w:val="40"/>
+        </w:rPr>
+        <w:t xml:space="preserve">, perspectiva cuantitativa 3 renglones y 5 </w:t>
+      </w:r>
+      <w:r>
+        <w:rPr>
+          <w:sz w:val="40"/>
+          <w:szCs w:val="40"/>
+        </w:rPr>
+        <w:t>ejemplos, perspectiva cualitativa 3</w:t>
+      </w:r>
+      <w:r>
+        <w:rPr>
+          <w:sz w:val="40"/>
+          <w:szCs w:val="40"/>
+        </w:rPr>
+        <w:t xml:space="preserve"> renglones</w:t>
+      </w:r>
+      <w:r>
+        <w:rPr>
+          <w:sz w:val="40"/>
+          <w:szCs w:val="40"/>
+        </w:rPr>
+        <w:t xml:space="preserve"> </w:t>
+      </w:r>
+      <w:r>
+        <w:rPr>
+          <w:sz w:val="40"/>
+          <w:szCs w:val="40"/>
+        </w:rPr>
+        <w:t xml:space="preserve">y 5 ejemplos y por ultimo anotar que significaba SCRUM con sus características que esto </w:t>
+      </w:r>
+      <w:proofErr w:type="spellStart"/>
+      <w:r>
+        <w:rPr>
+          <w:sz w:val="40"/>
+          <w:szCs w:val="40"/>
+        </w:rPr>
+        <w:t>seria</w:t>
+      </w:r>
+      <w:proofErr w:type="spellEnd"/>
+      <w:r>
+        <w:rPr>
+          <w:sz w:val="40"/>
+          <w:szCs w:val="40"/>
+        </w:rPr>
+        <w:t xml:space="preserve"> ½ de cuartilla de preferencia nos dijo que las perspectivas fueran sobre nuestro proyecto y eso fue todo lo que hicimos y vimos el dia martes.</w:t>
+      </w:r>
+      <w:r>
+        <w:rPr>
+          <w:sz w:val="40"/>
+          <w:szCs w:val="40"/>
+        </w:rPr>
+        <w:t xml:space="preserve">                                                                                                    </w:t>
       </w:r>
     </w:p>
     <w:sectPr>

</xml_diff>

<commit_message>
resolucion paso a paso de la funcion de ackley sobre el vector[1,0,1,0,5], introduccion y calculo de la funcion Griewank con productorias en vectores[3,2,1] y [-2,-4,-3]. analisis de funciones de prueba SFU Benchmark
</commit_message>
<xml_diff>
--- a/Lo que vimos en la semana              lunes.docx
+++ b/Lo que vimos en la semana              lunes.docx
@@ -2000,6 +2000,27 @@
           <w:sz w:val="40"/>
           <w:szCs w:val="40"/>
         </w:rPr>
+        <w:t xml:space="preserve"> 5 renglones</w:t>
+      </w:r>
+      <w:r>
+        <w:rPr>
+          <w:sz w:val="40"/>
+          <w:szCs w:val="40"/>
+        </w:rPr>
+        <w:t xml:space="preserve">, perspectiva cuantitativa 3 renglones y 5 </w:t>
+      </w:r>
+      <w:r>
+        <w:rPr>
+          <w:sz w:val="40"/>
+          <w:szCs w:val="40"/>
+        </w:rPr>
+        <w:t>ejemplos, perspectiva cualitativa 3 renglones</w:t>
+      </w:r>
+      <w:r>
+        <w:rPr>
+          <w:sz w:val="40"/>
+          <w:szCs w:val="40"/>
+        </w:rPr>
         <w:t xml:space="preserve"> </w:t>
       </w:r>
       <w:r>
@@ -2007,29 +2028,217 @@
           <w:sz w:val="40"/>
           <w:szCs w:val="40"/>
         </w:rPr>
-        <w:t>5 renglones</w:t>
-      </w:r>
-      <w:r>
-        <w:rPr>
-          <w:sz w:val="40"/>
-          <w:szCs w:val="40"/>
-        </w:rPr>
-        <w:t xml:space="preserve">, perspectiva cuantitativa 3 renglones y 5 </w:t>
-      </w:r>
-      <w:r>
-        <w:rPr>
-          <w:sz w:val="40"/>
-          <w:szCs w:val="40"/>
-        </w:rPr>
-        <w:t>ejemplos, perspectiva cualitativa 3</w:t>
-      </w:r>
-      <w:r>
-        <w:rPr>
-          <w:sz w:val="40"/>
-          <w:szCs w:val="40"/>
-        </w:rPr>
-        <w:t xml:space="preserve"> renglones</w:t>
-      </w:r>
+        <w:t xml:space="preserve">y 5 ejemplos y por ultimo anotar que significaba SCRUM con sus características que esto </w:t>
+      </w:r>
+      <w:proofErr w:type="spellStart"/>
+      <w:r>
+        <w:rPr>
+          <w:sz w:val="40"/>
+          <w:szCs w:val="40"/>
+        </w:rPr>
+        <w:t>seria</w:t>
+      </w:r>
+      <w:proofErr w:type="spellEnd"/>
+      <w:r>
+        <w:rPr>
+          <w:sz w:val="40"/>
+          <w:szCs w:val="40"/>
+        </w:rPr>
+        <w:t xml:space="preserve"> ½ de cuartilla de preferencia nos dijo que las perspectivas fueran sobre nuestro proyecto y eso fue todo lo que hicimos y vimos el dia martes.</w:t>
+      </w:r>
+      <w:r>
+        <w:rPr>
+          <w:sz w:val="40"/>
+          <w:szCs w:val="40"/>
+        </w:rPr>
+        <w:t xml:space="preserve">   </w:t>
+      </w:r>
+    </w:p>
+    <w:p>
+      <w:pPr>
+        <w:rPr>
+          <w:sz w:val="40"/>
+          <w:szCs w:val="40"/>
+        </w:rPr>
+      </w:pPr>
+    </w:p>
+    <w:p>
+      <w:pPr>
+        <w:rPr>
+          <w:sz w:val="40"/>
+          <w:szCs w:val="40"/>
+        </w:rPr>
+      </w:pPr>
+    </w:p>
+    <w:p>
+      <w:pPr>
+        <w:rPr>
+          <w:sz w:val="40"/>
+          <w:szCs w:val="40"/>
+        </w:rPr>
+      </w:pPr>
+    </w:p>
+    <w:p>
+      <w:pPr>
+        <w:rPr>
+          <w:sz w:val="40"/>
+          <w:szCs w:val="40"/>
+        </w:rPr>
+      </w:pPr>
+    </w:p>
+    <w:p>
+      <w:pPr>
+        <w:rPr>
+          <w:sz w:val="40"/>
+          <w:szCs w:val="40"/>
+        </w:rPr>
+      </w:pPr>
+    </w:p>
+    <w:p>
+      <w:pPr>
+        <w:rPr>
+          <w:sz w:val="40"/>
+          <w:szCs w:val="40"/>
+        </w:rPr>
+      </w:pPr>
+    </w:p>
+    <w:p>
+      <w:pPr>
+        <w:rPr>
+          <w:sz w:val="40"/>
+          <w:szCs w:val="40"/>
+        </w:rPr>
+      </w:pPr>
+    </w:p>
+    <w:p>
+      <w:pPr>
+        <w:rPr>
+          <w:sz w:val="40"/>
+          <w:szCs w:val="40"/>
+        </w:rPr>
+      </w:pPr>
+      <w:r>
+        <w:rPr>
+          <w:sz w:val="40"/>
+          <w:szCs w:val="40"/>
+        </w:rPr>
+        <w:lastRenderedPageBreak/>
+        <w:t xml:space="preserve">El </w:t>
+      </w:r>
+      <w:proofErr w:type="spellStart"/>
+      <w:r>
+        <w:rPr>
+          <w:sz w:val="40"/>
+          <w:szCs w:val="40"/>
+        </w:rPr>
+        <w:t>dia</w:t>
+      </w:r>
+      <w:proofErr w:type="spellEnd"/>
+      <w:r>
+        <w:rPr>
+          <w:sz w:val="40"/>
+          <w:szCs w:val="40"/>
+        </w:rPr>
+        <w:t xml:space="preserve"> miércoles que ese fueron clases normales fuera de nuestro proyecto y retomamos lo de las ecuaciones Ackley el </w:t>
+      </w:r>
+      <w:proofErr w:type="spellStart"/>
+      <w:proofErr w:type="gramStart"/>
+      <w:r>
+        <w:rPr>
+          <w:sz w:val="40"/>
+          <w:szCs w:val="40"/>
+        </w:rPr>
+        <w:t>doc.Héctor</w:t>
+      </w:r>
+      <w:proofErr w:type="spellEnd"/>
+      <w:proofErr w:type="gramEnd"/>
+      <w:r>
+        <w:rPr>
+          <w:sz w:val="40"/>
+          <w:szCs w:val="40"/>
+        </w:rPr>
+        <w:t xml:space="preserve"> nos puso 3 ecuaciones 1 con el </w:t>
+      </w:r>
+      <w:proofErr w:type="spellStart"/>
+      <w:r>
+        <w:rPr>
+          <w:sz w:val="40"/>
+          <w:szCs w:val="40"/>
+        </w:rPr>
+        <w:t>ackley</w:t>
+      </w:r>
+      <w:proofErr w:type="spellEnd"/>
+      <w:r>
+        <w:rPr>
+          <w:sz w:val="40"/>
+          <w:szCs w:val="40"/>
+        </w:rPr>
+        <w:t xml:space="preserve"> y otros dos </w:t>
+      </w:r>
+      <w:r>
+        <w:rPr>
+          <w:sz w:val="40"/>
+          <w:szCs w:val="40"/>
+        </w:rPr>
+        <w:t xml:space="preserve">llamados </w:t>
+      </w:r>
+      <w:proofErr w:type="spellStart"/>
+      <w:r>
+        <w:rPr>
+          <w:sz w:val="40"/>
+          <w:szCs w:val="40"/>
+        </w:rPr>
+        <w:t>Griewonk</w:t>
+      </w:r>
+      <w:proofErr w:type="spellEnd"/>
+      <w:r>
+        <w:rPr>
+          <w:sz w:val="40"/>
+          <w:szCs w:val="40"/>
+        </w:rPr>
+        <w:t xml:space="preserve"> y que esos los buscaríamos </w:t>
+      </w:r>
+      <w:r>
+        <w:rPr>
+          <w:sz w:val="40"/>
+          <w:szCs w:val="40"/>
+        </w:rPr>
+        <w:t xml:space="preserve">con este </w:t>
+      </w:r>
+      <w:proofErr w:type="spellStart"/>
+      <w:r>
+        <w:rPr>
+          <w:sz w:val="40"/>
+          <w:szCs w:val="40"/>
+        </w:rPr>
+        <w:t>titulo</w:t>
+      </w:r>
+      <w:proofErr w:type="spellEnd"/>
+      <w:r>
+        <w:rPr>
+          <w:sz w:val="40"/>
+          <w:szCs w:val="40"/>
+        </w:rPr>
+        <w:t xml:space="preserve"> en </w:t>
+      </w:r>
+      <w:proofErr w:type="spellStart"/>
+      <w:proofErr w:type="gramStart"/>
+      <w:r>
+        <w:rPr>
+          <w:sz w:val="40"/>
+          <w:szCs w:val="40"/>
+        </w:rPr>
+        <w:t>Google:</w:t>
+      </w:r>
+      <w:r>
+        <w:rPr>
+          <w:sz w:val="40"/>
+          <w:szCs w:val="40"/>
+        </w:rPr>
+        <w:t>SFU</w:t>
+      </w:r>
+      <w:proofErr w:type="spellEnd"/>
+      <w:proofErr w:type="gramEnd"/>
       <w:r>
         <w:rPr>
           <w:sz w:val="40"/>
@@ -2037,20 +2246,13 @@
         </w:rPr>
         <w:t xml:space="preserve"> </w:t>
       </w:r>
-      <w:r>
-        <w:rPr>
-          <w:sz w:val="40"/>
-          <w:szCs w:val="40"/>
-        </w:rPr>
-        <w:t xml:space="preserve">y 5 ejemplos y por ultimo anotar que significaba SCRUM con sus características que esto </w:t>
-      </w:r>
       <w:proofErr w:type="spellStart"/>
       <w:r>
         <w:rPr>
           <w:sz w:val="40"/>
           <w:szCs w:val="40"/>
         </w:rPr>
-        <w:t>seria</w:t>
+        <w:t>Benchmark</w:t>
       </w:r>
       <w:proofErr w:type="spellEnd"/>
       <w:r>
@@ -2058,14 +2260,254 @@
           <w:sz w:val="40"/>
           <w:szCs w:val="40"/>
         </w:rPr>
-        <w:t xml:space="preserve"> ½ de cuartilla de preferencia nos dijo que las perspectivas fueran sobre nuestro proyecto y eso fue todo lo que hicimos y vimos el dia martes.</w:t>
-      </w:r>
-      <w:r>
-        <w:rPr>
-          <w:sz w:val="40"/>
-          <w:szCs w:val="40"/>
-        </w:rPr>
-        <w:t xml:space="preserve">                                                                                                    </w:t>
+        <w:t xml:space="preserve"> </w:t>
+      </w:r>
+      <w:proofErr w:type="spellStart"/>
+      <w:r>
+        <w:rPr>
+          <w:sz w:val="40"/>
+          <w:szCs w:val="40"/>
+        </w:rPr>
+        <w:t>funtion</w:t>
+      </w:r>
+      <w:proofErr w:type="spellEnd"/>
+      <w:r>
+        <w:rPr>
+          <w:sz w:val="40"/>
+          <w:szCs w:val="40"/>
+        </w:rPr>
+        <w:t xml:space="preserve"> cosa que era nuevo </w:t>
+      </w:r>
+      <w:r>
+        <w:rPr>
+          <w:sz w:val="40"/>
+          <w:szCs w:val="40"/>
+        </w:rPr>
+        <w:t>p</w:t>
+      </w:r>
+      <w:r>
+        <w:rPr>
+          <w:sz w:val="40"/>
+          <w:szCs w:val="40"/>
+        </w:rPr>
+        <w:t>ara nosotros y dijo que el que los contestara podía salir nos comento los vectores que llevaría cada una de ellas como</w:t>
+      </w:r>
+    </w:p>
+    <w:p>
+      <w:pPr>
+        <w:rPr>
+          <w:sz w:val="40"/>
+          <w:szCs w:val="40"/>
+        </w:rPr>
+      </w:pPr>
+      <w:r>
+        <w:rPr>
+          <w:sz w:val="40"/>
+          <w:szCs w:val="40"/>
+        </w:rPr>
+        <w:t>Ackley [1,0,1,0,5]</w:t>
+      </w:r>
+    </w:p>
+    <w:p>
+      <w:pPr>
+        <w:rPr>
+          <w:sz w:val="40"/>
+          <w:szCs w:val="40"/>
+        </w:rPr>
+      </w:pPr>
+      <w:proofErr w:type="spellStart"/>
+      <w:r>
+        <w:rPr>
+          <w:sz w:val="40"/>
+          <w:szCs w:val="40"/>
+        </w:rPr>
+        <w:t>Grie</w:t>
+      </w:r>
+      <w:r>
+        <w:rPr>
+          <w:sz w:val="40"/>
+          <w:szCs w:val="40"/>
+        </w:rPr>
+        <w:t>wonk</w:t>
+      </w:r>
+      <w:proofErr w:type="spellEnd"/>
+      <w:r>
+        <w:rPr>
+          <w:sz w:val="40"/>
+          <w:szCs w:val="40"/>
+        </w:rPr>
+        <w:t xml:space="preserve"> [3,2,1]</w:t>
+      </w:r>
+    </w:p>
+    <w:p>
+      <w:pPr>
+        <w:rPr>
+          <w:sz w:val="40"/>
+          <w:szCs w:val="40"/>
+        </w:rPr>
+      </w:pPr>
+      <w:proofErr w:type="spellStart"/>
+      <w:r>
+        <w:rPr>
+          <w:sz w:val="40"/>
+          <w:szCs w:val="40"/>
+        </w:rPr>
+        <w:t>Griewonk</w:t>
+      </w:r>
+      <w:proofErr w:type="spellEnd"/>
+      <w:r>
+        <w:rPr>
+          <w:sz w:val="40"/>
+          <w:szCs w:val="40"/>
+        </w:rPr>
+        <w:t xml:space="preserve"> [</w:t>
+      </w:r>
+      <w:r>
+        <w:rPr>
+          <w:sz w:val="40"/>
+          <w:szCs w:val="40"/>
+        </w:rPr>
+        <w:t>-2,-4,-3</w:t>
+      </w:r>
+      <w:r>
+        <w:rPr>
+          <w:sz w:val="40"/>
+          <w:szCs w:val="40"/>
+        </w:rPr>
+        <w:t>]</w:t>
+      </w:r>
+    </w:p>
+    <w:p>
+      <w:pPr>
+        <w:rPr>
+          <w:sz w:val="40"/>
+          <w:szCs w:val="40"/>
+        </w:rPr>
+      </w:pPr>
+      <w:r>
+        <w:rPr>
+          <w:sz w:val="40"/>
+          <w:szCs w:val="40"/>
+        </w:rPr>
+        <w:t xml:space="preserve">Como ya sabemos los </w:t>
+      </w:r>
+      <w:proofErr w:type="spellStart"/>
+      <w:r>
+        <w:rPr>
+          <w:sz w:val="40"/>
+          <w:szCs w:val="40"/>
+        </w:rPr>
+        <w:t>ackley</w:t>
+      </w:r>
+      <w:proofErr w:type="spellEnd"/>
+      <w:r>
+        <w:rPr>
+          <w:sz w:val="40"/>
+          <w:szCs w:val="40"/>
+        </w:rPr>
+        <w:t xml:space="preserve"> se usaban sumatorias de acuerdo, pero en los de </w:t>
+      </w:r>
+      <w:proofErr w:type="spellStart"/>
+      <w:r>
+        <w:rPr>
+          <w:sz w:val="40"/>
+          <w:szCs w:val="40"/>
+        </w:rPr>
+        <w:t>griewonk</w:t>
+      </w:r>
+      <w:proofErr w:type="spellEnd"/>
+      <w:r>
+        <w:rPr>
+          <w:sz w:val="40"/>
+          <w:szCs w:val="40"/>
+        </w:rPr>
+        <w:t xml:space="preserve"> se utilizaría la </w:t>
+      </w:r>
+      <w:proofErr w:type="spellStart"/>
+      <w:r>
+        <w:rPr>
+          <w:sz w:val="40"/>
+          <w:szCs w:val="40"/>
+        </w:rPr>
+        <w:t>productoria</w:t>
+      </w:r>
+      <w:proofErr w:type="spellEnd"/>
+      <w:r>
+        <w:rPr>
+          <w:sz w:val="40"/>
+          <w:szCs w:val="40"/>
+        </w:rPr>
+        <w:t>.</w:t>
+      </w:r>
+    </w:p>
+    <w:p>
+      <w:pPr>
+        <w:rPr>
+          <w:sz w:val="40"/>
+          <w:szCs w:val="40"/>
+        </w:rPr>
+      </w:pPr>
+      <w:r>
+        <w:rPr>
+          <w:sz w:val="40"/>
+          <w:szCs w:val="40"/>
+        </w:rPr>
+        <w:t xml:space="preserve">Los de </w:t>
+      </w:r>
+      <w:proofErr w:type="spellStart"/>
+      <w:r>
+        <w:rPr>
+          <w:sz w:val="40"/>
+          <w:szCs w:val="40"/>
+        </w:rPr>
+        <w:t>griewonk</w:t>
+      </w:r>
+      <w:proofErr w:type="spellEnd"/>
+      <w:r>
+        <w:rPr>
+          <w:sz w:val="40"/>
+          <w:szCs w:val="40"/>
+        </w:rPr>
+        <w:t xml:space="preserve"> para poder realizarlos solo seria utilizar los vectores y dividirlos sobre 4000 tipo </w:t>
+      </w:r>
+      <w:proofErr w:type="spellStart"/>
+      <w:r>
+        <w:rPr>
+          <w:sz w:val="40"/>
+          <w:szCs w:val="40"/>
+        </w:rPr>
+        <w:t>asi</w:t>
+      </w:r>
+      <w:proofErr w:type="spellEnd"/>
+    </w:p>
+    <w:p>
+      <w:pPr>
+        <w:rPr>
+          <w:sz w:val="40"/>
+          <w:szCs w:val="40"/>
+        </w:rPr>
+      </w:pPr>
+      <w:r>
+        <w:rPr>
+          <w:sz w:val="40"/>
+          <w:szCs w:val="40"/>
+        </w:rPr>
+        <w:t xml:space="preserve">(3) /4000 el 3 elevado al cuadrado y el resultado seria 0.00225 y así se resolvería con los demás vectores </w:t>
+      </w:r>
+    </w:p>
+    <w:p>
+      <w:pPr>
+        <w:rPr>
+          <w:sz w:val="40"/>
+          <w:szCs w:val="40"/>
+        </w:rPr>
+      </w:pPr>
+      <w:r>
+        <w:rPr>
+          <w:sz w:val="40"/>
+          <w:szCs w:val="40"/>
+        </w:rPr>
+        <w:t>Y eso fue todo por esta semana.</w:t>
       </w:r>
     </w:p>
     <w:sectPr>

</xml_diff>